<commit_message>
Adding cruise context data section
</commit_message>
<xml_diff>
--- a/manuscript/manuscript.docx
+++ b/manuscript/manuscript.docx
@@ -7,7 +7,7 @@
         <w:pStyle w:val="Title"/>
       </w:pPr>
       <w:r>
-        <w:t xml:space="preserve">Nitrogen’s form determines its fate in the North Pacific Subtropical Gyre during PARAGON I</w:t>
+        <w:t xml:space="preserve">Nitrogen’s form determines its fate in the North Pacific Subtropical Gyre</w:t>
       </w:r>
     </w:p>
     <w:p>
@@ -15,31 +15,7 @@
         <w:pStyle w:val="Author"/>
       </w:pPr>
       <w:r>
-        <w:t xml:space="preserve">William Kumler</w:t>
-      </w:r>
-    </w:p>
-    <w:p>
-      <w:pPr>
-        <w:pStyle w:val="Author"/>
-      </w:pPr>
-      <w:r>
-        <w:t xml:space="preserve">Laura T. Carlson</w:t>
-      </w:r>
-    </w:p>
-    <w:p>
-      <w:pPr>
-        <w:pStyle w:val="Author"/>
-      </w:pPr>
-      <w:r>
-        <w:t xml:space="preserve">Anitra E. Ingalls</w:t>
-      </w:r>
-    </w:p>
-    <w:p>
-      <w:pPr>
-        <w:pStyle w:val="Author"/>
-      </w:pPr>
-      <w:r>
-        <w:t xml:space="preserve">Other SCOPE collaborators</w:t>
+        <w:t xml:space="preserve">William Kumler, Laura T. Carlson, Rhea K. Foreman, Eric Grabowski, Fernanda Henderikx Freitas, Fuyan Li, Matthew J. Church, Ed F. DeLong, Angelicque E. White, David M. Karl, Anitra E. Ingalls</w:t>
       </w:r>
     </w:p>
     <w:bookmarkStart w:id="20" w:name="abstract"/>
@@ -56,11 +32,11 @@
         <w:pStyle w:val="FirstParagraph"/>
       </w:pPr>
       <w:r>
-        <w:t xml:space="preserve">Nitrogen availability controls productivity in much of the surface ocean and the form of this nitrogen controls who it is available to and how it is used. Here, we explored how four different forms of nitrogen (ammonia, nitrate, arginine, and guanosine monophosphate) were taken up and transformed in the North Pacific Subtropical Gyre using stable isotope labeling metabolomics. We repeated these experiments both at the surface and at the base of the euphotic zone as well as in the morning and evening. We found that ammonia is converted into glutamate in less than 20 minutes and results in labeling throughout the metabolome, though osmolytes like betaines had slow turnover rates. This process was slower at depth but largely independent of time of day. Nitrate amendments resulted in the labeling of only a small subset of molecules such as mycosporine-like amino acids, whose incorporation patterns suggest that this form of nitrogen was available to a subset of the community, likely eukaryotes. The two organic nitrogen amendments labeled the metabolome more slowly than the inorganic forms of nitrogen and showed similar usage at depth and at the surface, hinting at the major role that heterotrophic bacteria likely play in their uptake and use. A large fraction of the organic nitrogen added was remineralized into ammonia and used as glutamate rather than as intact substrates, though labeled arginine was incorporated into proteins directly. These measurements reveal the forms and fluxes of organic nitrogen in the natural environment to provide constraints on biogeochemical models and better characterize the transformations between organic and inorganic nitrogen.</w:t>
+        <w:t xml:space="preserve">Nitrogen availability controls productivity in much of the surface ocean and the form of this nitrogen controls who it is available to and how it is used. Here, we explored how four different forms of nitrogen (ammonia, nitrate, arginine, and guanosine monophosphate) were taken up and transformed in the North Pacific Subtropical Gyre using stable isotope labeling metabolomics. We repeated these experiments both at the surface and at the base of the euphotic zone as well as in the morning and evening. We found that ammonia is converted into glutamate in less than 20 minutes and results in labeling throughout the metabolome after 24 hours, though osmolytes like betaines had slow turnover rates. Nitrate amendments resulted in the labeling of only a small subset of molecules such as mycosporine-like amino acids (MAAs), whose incorporation patterns suggest that this form of nitrogen was available to a subset of the community, likely eukaryotes. The two organic nitrogen amendments labeled the metabolome more slowly than the inorganic forms of nitrogen and showed similar usage at 25 meters and 175 meters, hinting at the major role that heterotrophic bacteria play in cycling organic matter. The organic nitrogen added was mostly converted into glutamate after 24 hours rather than used as intact substrates, though labeled arginine was incorporated into protein directly and we were able to trace the carbon backbone from both arginine and GMP into several additional metabolites. We also show that nitrogen assimilation and use was largely the same between morning and evening with the exception of UV-sensitive compounds such as MAAs. These measurements reveal the forms and fluxes of nitrogen in the natural environment and provide constraints on biogeochemical models that require characterizing the transformations between organic and inorganic nitrogen.</w:t>
       </w:r>
     </w:p>
     <w:bookmarkEnd w:id="20"/>
-    <w:bookmarkStart w:id="23" w:name="introduction"/>
+    <w:bookmarkStart w:id="21" w:name="introduction"/>
     <w:p>
       <w:pPr>
         <w:pStyle w:val="Heading1"/>
@@ -74,22 +50,39 @@
         <w:pStyle w:val="FirstParagraph"/>
       </w:pPr>
       <w:r>
-        <w:t xml:space="preserve">Marine carbon is fixed into biomass very quickly. In most of the surface ocean this flux is controlled by the availability of nitrogen, an element with a complex and incompletely characterized biogeochemical cycle</w:t>
-      </w:r>
-      <w:r>
-        <w:t xml:space="preserve"> </w:t>
-      </w:r>
-      <w:r>
-        <w:t xml:space="preserve">[@Capone2008; @Moore2013; @Hutchins2022]</w:t>
-      </w:r>
-      <w:r>
-        <w:t xml:space="preserve">. Organic nitrogen in particular is often treated as a black box despite substantial variability in its bioavailability and chemical nature. While extensive work has been done to characterize the forms and fluxes of nitrogen within the inorganic pool, the equivalent for the organic pool is woefully underdeveloped</w:t>
-      </w:r>
-      <w:r>
-        <w:t xml:space="preserve"> </w:t>
-      </w:r>
-      <w:r>
-        <w:t xml:space="preserve">[@ref, prob NME2008 or Hansell2024, maybe @Hutchins2022 for visual?]</w:t>
+        <w:t xml:space="preserve">In most of the surface ocean the flux of carbon is controlled by the availability of nitrogen, an element with a complex and incompletely characterized biogeochemical cycle</w:t>
+      </w:r>
+      <w:r>
+        <w:t xml:space="preserve"> </w:t>
+      </w:r>
+      <w:r>
+        <w:t xml:space="preserve">[@Bronk2008; @Moore2013; @Hutchins2022]</w:t>
+      </w:r>
+      <w:r>
+        <w:t xml:space="preserve">. Organic nitrogen in particular is often treated as a black box despite substantial variability in its bioavailability and chemical nature. Turnover times for labile organic compounds like urea and amino acids can be orders of magnitude shorter than high molecular weight DON</w:t>
+      </w:r>
+      <w:r>
+        <w:t xml:space="preserve"> </w:t>
+      </w:r>
+      <w:r>
+        <w:t xml:space="preserve">[@Aluwihare2005; @Bronk2024]</w:t>
+      </w:r>
+      <w:r>
+        <w:t xml:space="preserve">. Additionally, the availability of the precious nitrogen atom is determined not only by the form of the organic material it composes but also the environment in which it’s found.</w:t>
+      </w:r>
+    </w:p>
+    <w:p>
+      <w:pPr>
+        <w:pStyle w:val="BodyText"/>
+      </w:pPr>
+      <w:r>
+        <w:t xml:space="preserve">While extensive work has been done to characterize the forms and fluxes of nitrogen within the inorganic pool, the equivalent for the organic pool is woefully underdeveloped</w:t>
+      </w:r>
+      <w:r>
+        <w:t xml:space="preserve"> </w:t>
+      </w:r>
+      <w:r>
+        <w:t xml:space="preserve">[@Zehr2011; @NME]</w:t>
       </w:r>
       <w:r>
         <w:t xml:space="preserve">. This is largely due to the difficulty of comprehensively measuring the many organic molecules that contain nitrogen in the marine environment</w:t>
@@ -101,7 +94,16 @@
         <w:t xml:space="preserve">[@Boysen2018; @Moran2022]</w:t>
       </w:r>
       <w:r>
-        <w:t xml:space="preserve">. The bioavailability of the nitrogen atom is in the environment is largely determined by the form of the organic material it composes.</w:t>
+        <w:t xml:space="preserve">. Recently, however, we have improved our understanding of community composition via genomics and transcriptomics and made progress in our ability to characterize organic matter via proteomics and metabolomics. These advancements, paired with the increased availability of pure and isotope-labeled substrates, mean that we can now apply metabolically resolved isotope tracing to resolve how organic nitrogen is transformed in the marketplace of metabolites that power the surface ocean</w:t>
+      </w:r>
+      <w:r>
+        <w:t xml:space="preserve"> </w:t>
+      </w:r>
+      <w:r>
+        <w:t xml:space="preserve">[@Heal2021; @McParland2021; @Moran2022]</w:t>
+      </w:r>
+      <w:r>
+        <w:t xml:space="preserve">.</w:t>
       </w:r>
     </w:p>
     <w:p>
@@ -109,28 +111,34 @@
         <w:pStyle w:val="BodyText"/>
       </w:pPr>
       <w:r>
-        <w:t xml:space="preserve">The mechanisms by which dissolved nitrogen becomes biomass and vice versa are major factors in our ability to predict ecosystem productivity and therefore carbon fixation and export. Traditionally, the conversion of inorganic material into organic substrate was thought to be limited to autotrophs while remineralization was performed by the heterotrophic community. Today, it’s known that many photosynthetic organisms are able to take up and use organic nitrogen</w:t>
-      </w:r>
-      <w:r>
-        <w:t xml:space="preserve"> </w:t>
-      </w:r>
-      <w:r>
-        <w:t xml:space="preserve">[@Anita1991; @Morando2018; @Hugo2021]</w:t>
-      </w:r>
-      <w:r>
-        <w:t xml:space="preserve"> </w:t>
-      </w:r>
-      <w:r>
-        <w:t xml:space="preserve">and that only a select subset of phototrophs are capable of nitrate reduction or nitrogen fixation</w:t>
-      </w:r>
-      <w:r>
-        <w:t xml:space="preserve"> </w:t>
-      </w:r>
-      <w:r>
-        <w:t xml:space="preserve">[@ref]</w:t>
-      </w:r>
-      <w:r>
-        <w:t xml:space="preserve">, while inorganic nitrogen is directly accessible to heterotrophs as well. This means that the transformations possible for a given N-containing compound are a function of the microbial community and its environment while the microbial community is in turn also expected to be a function of the N-containing molecules available. This creates a recursive network that’s difficult to untangle and cannot necessarily be extrapolated from axenic culture studies.</w:t>
+        <w:t xml:space="preserve">Nitrogen assimilation is a well-documented process in the ocean after decades of research and demonstrates how biochemistry derived from non-marine organisms can be applied to the ocean</w:t>
+      </w:r>
+      <w:r>
+        <w:t xml:space="preserve"> </w:t>
+      </w:r>
+      <w:r>
+        <w:t xml:space="preserve">[@Mulholland2008]</w:t>
+      </w:r>
+      <w:r>
+        <w:t xml:space="preserve">. Central to the process is ammonia, which can be directly taken up from the environment by all organisms and combined with glutamate. This forms glutamine, which is then combined with alpha-ketoglutarate to form two glutamate molecules that can then be used as a nitrogen source throughout the cell</w:t>
+      </w:r>
+      <w:r>
+        <w:t xml:space="preserve"> </w:t>
+      </w:r>
+      <w:r>
+        <w:t xml:space="preserve">[@Walker2016]</w:t>
+      </w:r>
+      <w:r>
+        <w:t xml:space="preserve">. Nitrate, on the other hand, must first be reduced to ammonia in an energetically expensive process that some organisms have stripped from their genomes</w:t>
+      </w:r>
+      <w:r>
+        <w:t xml:space="preserve"> </w:t>
+      </w:r>
+      <w:r>
+        <w:t xml:space="preserve">[@Partensky2010; @Zehr2011]</w:t>
+      </w:r>
+      <w:r>
+        <w:t xml:space="preserve">.</w:t>
       </w:r>
     </w:p>
     <w:p>
@@ -138,250 +146,46 @@
         <w:pStyle w:val="BodyText"/>
       </w:pPr>
       <w:r>
-        <w:t xml:space="preserve">One way to reveal the pathways and transformations that marine N undergoes in a natural community is via 15N labeling paired with metabolomics. Metabolites that incorporate the labeled nitrogen can then be separated on the mass spectrometer and quantified separately from the unlabeled pool. Here, we trace the uptake and use of labeled ammonia, nitrate, arginine, and guanosine monophosphate in a natural community from the NPSG at multiple depths and diel conditions. Our application of metabolomics to these samples allows us to map out the pathways and restructuring that organic nitrogen experiences in the largest biomes on the planet, quantifying the pool sizes and turnover rates for various low molecular weight compounds that serve as building blocks and intermediates of cell biology.</w:t>
-      </w:r>
-    </w:p>
-    <w:bookmarkStart w:id="21" w:name="other-things-to-maybe-discuss"/>
-    <w:p>
-      <w:pPr>
-        <w:pStyle w:val="Heading2"/>
-      </w:pPr>
-      <w:r>
-        <w:t xml:space="preserve">Other things to maybe discuss:</w:t>
-      </w:r>
-    </w:p>
-    <w:p>
-      <w:pPr>
-        <w:pStyle w:val="Compact"/>
-        <w:numPr>
-          <w:ilvl w:val="0"/>
-          <w:numId w:val="1001"/>
-        </w:numPr>
-      </w:pPr>
-      <w:r>
-        <w:t xml:space="preserve">mention the expected differences with depth and diel effects</w:t>
-      </w:r>
-    </w:p>
-    <w:p>
-      <w:pPr>
-        <w:pStyle w:val="Compact"/>
-        <w:numPr>
-          <w:ilvl w:val="0"/>
-          <w:numId w:val="1001"/>
-        </w:numPr>
-      </w:pPr>
-      <w:r>
-        <w:t xml:space="preserve">detail which compounds we chose and why?</w:t>
-      </w:r>
-    </w:p>
-    <w:p>
-      <w:pPr>
-        <w:pStyle w:val="Compact"/>
-        <w:numPr>
-          <w:ilvl w:val="0"/>
-          <w:numId w:val="1001"/>
-        </w:numPr>
-      </w:pPr>
-      <w:r>
-        <w:t xml:space="preserve">expand on DON-PON interactions and importance?</w:t>
-      </w:r>
-    </w:p>
-    <w:p>
-      <w:pPr>
-        <w:pStyle w:val="Compact"/>
-        <w:numPr>
-          <w:ilvl w:val="0"/>
-          <w:numId w:val="1001"/>
-        </w:numPr>
-      </w:pPr>
-      <w:r>
-        <w:t xml:space="preserve">Extracellular enzymes, organic use as ammonia vs as-is?</w:t>
-      </w:r>
-    </w:p>
-    <w:p>
-      <w:pPr>
-        <w:pStyle w:val="Compact"/>
-        <w:numPr>
-          <w:ilvl w:val="0"/>
-          <w:numId w:val="1001"/>
-        </w:numPr>
-      </w:pPr>
-      <w:r>
-        <w:t xml:space="preserve">expand on the importance of biogeochemical models and why we need pathways mapped out?</w:t>
-      </w:r>
-    </w:p>
-    <w:p>
-      <w:pPr>
-        <w:pStyle w:val="Compact"/>
-        <w:numPr>
-          <w:ilvl w:val="0"/>
-          <w:numId w:val="1001"/>
-        </w:numPr>
-      </w:pPr>
-      <w:r>
-        <w:t xml:space="preserve">mention basic biosynthetic pathways (maybe better suited to discussion?)</w:t>
-      </w:r>
-    </w:p>
-    <w:p>
-      <w:pPr>
-        <w:pStyle w:val="Compact"/>
-        <w:numPr>
-          <w:ilvl w:val="0"/>
-          <w:numId w:val="1001"/>
-        </w:numPr>
-      </w:pPr>
-      <w:r>
-        <w:t xml:space="preserve">new (nitrate) vs regenerated (ammonia and DON) production (maybe also discussion?)</w:t>
+        <w:t xml:space="preserve">Unlike the relatively well-resolved pathways for inorganic nitrogen, the use of organic nitrogen remains underexplored in the marine environment. Organic nitrogen is generally thought to be accessible to most organisms but the high levels of DON make it clear that this is highly substrate-specific</w:t>
+      </w:r>
+      <w:r>
+        <w:t xml:space="preserve"> </w:t>
+      </w:r>
+      <w:r>
+        <w:t xml:space="preserve">[@Antia1991; @Bronk2007; @Aluwihare2008; @Zehr2011; @Bronk2024]</w:t>
+      </w:r>
+      <w:r>
+        <w:t xml:space="preserve">. Additionally, many of the transformations possible are only active in specific communities or times of day</w:t>
+      </w:r>
+      <w:r>
+        <w:t xml:space="preserve"> </w:t>
+      </w:r>
+      <w:r>
+        <w:t xml:space="preserve">[@Bender2012]</w:t>
+      </w:r>
+      <w:r>
+        <w:t xml:space="preserve">. Linking the transformations that nitrogen undergoes to known molecular pathways from other environments or axenic cultures is a particularly promising way to understand what we observe on the global scale.</w:t>
+      </w:r>
+    </w:p>
+    <w:p>
+      <w:pPr>
+        <w:pStyle w:val="BodyText"/>
+      </w:pPr>
+      <w:r>
+        <w:t xml:space="preserve">The lack of a comprehensive understanding of nitrogen’s fate after it is assimilated makes molecular modeling difficult and undermines our ability to connect the community to the organic nitrogen it produces</w:t>
+      </w:r>
+      <w:r>
+        <w:t xml:space="preserve"> </w:t>
+      </w:r>
+      <w:r>
+        <w:t xml:space="preserve">[@Jones2024]</w:t>
+      </w:r>
+      <w:r>
+        <w:t xml:space="preserve">. Here, we trace the uptake and use of labeled ammonia, nitrate, arginine, and guanosine monophosphate in a natural community from the North Pacific Subtropical Gyre at multiple depths and diel conditions. Our application of metabolomics to these samples allows us to map the pathways and restructuring that organic nitrogen experiences in the largest biomes on the planet, quantifying the pool sizes and turnover rates for various low molecular weight compounds that serve as building blocks and intermediates of cell biology.</w:t>
       </w:r>
     </w:p>
     <w:bookmarkEnd w:id="21"/>
-    <w:bookmarkStart w:id="22" w:name="other-soundbites"/>
-    <w:p>
-      <w:pPr>
-        <w:pStyle w:val="Heading2"/>
-      </w:pPr>
-      <w:r>
-        <w:t xml:space="preserve">Other soundbites:</w:t>
-      </w:r>
-    </w:p>
-    <w:p>
-      <w:pPr>
-        <w:pStyle w:val="Compact"/>
-        <w:numPr>
-          <w:ilvl w:val="0"/>
-          <w:numId w:val="1002"/>
-        </w:numPr>
-      </w:pPr>
-      <w:r>
-        <w:t xml:space="preserve">It is assumed that most fixed nitrogen becomes protein, presumably based on the large fraction of cell nitrogen in protein and previous research showing how quickly it enters the (free?) amino acid pool. However, 1) important intermediates molecules 2) doesn’t explain where biounavailable N comes from 3) makes gene-based molecular modeling really difficult.</w:t>
-      </w:r>
-    </w:p>
-    <w:p>
-      <w:pPr>
-        <w:pStyle w:val="Compact"/>
-        <w:numPr>
-          <w:ilvl w:val="0"/>
-          <w:numId w:val="1002"/>
-        </w:numPr>
-      </w:pPr>
-      <w:r>
-        <w:t xml:space="preserve">In each case, assimilation into organic matter is typically done via the glutamine synthetase (GS)/glutamate synthase (GOGAT) or glutamate dehydrogenase (GDH) pathways to produce glutamate from α-ketoglutarate</w:t>
-      </w:r>
-      <w:r>
-        <w:t xml:space="preserve"> </w:t>
-      </w:r>
-      <w:r>
-        <w:t xml:space="preserve">[@ref, see bronk chapter]</w:t>
-      </w:r>
-      <w:r>
-        <w:t xml:space="preserve">. Glutamate then serves as a nitrogen supply in an enormous number of biochemical pathways in both primary and secondary metabolism</w:t>
-      </w:r>
-      <w:r>
-        <w:t xml:space="preserve"> </w:t>
-      </w:r>
-      <w:r>
-        <w:t xml:space="preserve">[@Walker2016]</w:t>
-      </w:r>
-      <w:r>
-        <w:t xml:space="preserve">.</w:t>
-      </w:r>
-    </w:p>
-    <w:p>
-      <w:pPr>
-        <w:pStyle w:val="Compact"/>
-        <w:numPr>
-          <w:ilvl w:val="0"/>
-          <w:numId w:val="1002"/>
-        </w:numPr>
-      </w:pPr>
-      <w:r>
-        <w:t xml:space="preserve">nitrate amendments typically resulting in diatom blooms while ammonia incubations favor cyanobacteria</w:t>
-      </w:r>
-      <w:r>
-        <w:t xml:space="preserve"> </w:t>
-      </w:r>
-      <w:r>
-        <w:t xml:space="preserve">[@Glibert2016]</w:t>
-      </w:r>
-      <w:r>
-        <w:t xml:space="preserve">.</w:t>
-      </w:r>
-    </w:p>
-    <w:p>
-      <w:pPr>
-        <w:pStyle w:val="Compact"/>
-        <w:numPr>
-          <w:ilvl w:val="0"/>
-          <w:numId w:val="1002"/>
-        </w:numPr>
-      </w:pPr>
-      <w:r>
-        <w:t xml:space="preserve">Communities to distinguish are 1) surface (largely regenerated production) and 2) 175m (largely new production(??))</w:t>
-      </w:r>
-    </w:p>
-    <w:p>
-      <w:pPr>
-        <w:pStyle w:val="Compact"/>
-        <w:numPr>
-          <w:ilvl w:val="0"/>
-          <w:numId w:val="1002"/>
-        </w:numPr>
-      </w:pPr>
-      <w:r>
-        <w:t xml:space="preserve">use of organics vs synthesis of organics</w:t>
-      </w:r>
-    </w:p>
-    <w:p>
-      <w:pPr>
-        <w:pStyle w:val="Compact"/>
-        <w:numPr>
-          <w:ilvl w:val="0"/>
-          <w:numId w:val="1002"/>
-        </w:numPr>
-      </w:pPr>
-      <w:r>
-        <w:t xml:space="preserve">Compounds such as non-proteinogenic amino acids (e.g., ornithine, citrulline, creatine, MAAs), osmolytes like betaines, nucleobases, and sulfur-containing molecules like taurine represent significant but poorly quantified pools. Understanding the rates and pathways by which these compounds are utilized is crucial, as they form the fundamental unit linking genetic potential to elemental cycling in biogeochemical models.</w:t>
-      </w:r>
-    </w:p>
-    <w:p>
-      <w:pPr>
-        <w:pStyle w:val="Compact"/>
-        <w:numPr>
-          <w:ilvl w:val="0"/>
-          <w:numId w:val="1002"/>
-        </w:numPr>
-      </w:pPr>
-      <w:r>
-        <w:t xml:space="preserve">Nitrogen use varies significantly between the sunlit surface where productivity is largely regenerated through recycling of ammonia and organic nitrogen, and deeper waters near the base of the euphotic zone, where nitrate supports</w:t>
-      </w:r>
-      <w:r>
-        <w:t xml:space="preserve"> </w:t>
-      </w:r>
-      <w:r>
-        <w:t xml:space="preserve">“new”</w:t>
-      </w:r>
-      <w:r>
-        <w:t xml:space="preserve"> </w:t>
-      </w:r>
-      <w:r>
-        <w:t xml:space="preserve">production. Quantifying rates of nitrogen assimilation into ammonia and downstream products across these gradients is therefore essential for predicting marine productivity and nutrient cycling.</w:t>
-      </w:r>
-    </w:p>
-    <w:p>
-      <w:pPr>
-        <w:pStyle w:val="Compact"/>
-        <w:numPr>
-          <w:ilvl w:val="0"/>
-          <w:numId w:val="1002"/>
-        </w:numPr>
-      </w:pPr>
-      <w:r>
-        <w:t xml:space="preserve">Nonetheless, how the community uses a substrate is arguably more important than whether it can.</w:t>
-      </w:r>
-    </w:p>
-    <w:bookmarkEnd w:id="22"/>
-    <w:bookmarkEnd w:id="23"/>
-    <w:bookmarkStart w:id="43" w:name="results"/>
+    <w:bookmarkStart w:id="41" w:name="results"/>
     <w:p>
       <w:pPr>
         <w:pStyle w:val="Heading1"/>
@@ -394,19 +198,72 @@
       <w:pPr>
         <w:pStyle w:val="FirstParagraph"/>
       </w:pPr>
-      <w:commentRangeStart w:id="0"/>
-      <w:r>
-        <w:t xml:space="preserve"> </w:t>
-      </w:r>
-      <w:commentRangeEnd w:id="0"/>
-      <w:r>
-        <w:rPr>
-          <w:rStyle w:val="CommentReference"/>
-        </w:rPr>
-        <w:commentReference w:id="0"/>
-      </w:r>
-    </w:p>
-    <w:bookmarkStart w:id="30" w:name="X50c3d78adc27cd079dbc22d10d7944c6219b921"/>
+      <w:r>
+        <w:t xml:space="preserve">Samples were collected from 25 meters and 175 meters during the 2021 SCOPE PARAGON cruise (KM2112, July 23rd - August 5th) near Station ALOHA that targeted a bloom within an anticyclonic eddy. The bloom was initially dominated by the diatom genus</w:t>
+      </w:r>
+      <w:r>
+        <w:t xml:space="preserve"> </w:t>
+      </w:r>
+      <w:r>
+        <w:rPr>
+          <w:i/>
+          <w:iCs/>
+        </w:rPr>
+        <w:t xml:space="preserve">Hemiaulus</w:t>
+      </w:r>
+      <w:r>
+        <w:t xml:space="preserve"> </w:t>
+      </w:r>
+      <w:r>
+        <w:t xml:space="preserve">with a large surface chlorophyll signal that decayed into a more typical North Pacific Subtropical Gyre community composed mostly of</w:t>
+      </w:r>
+      <w:r>
+        <w:t xml:space="preserve"> </w:t>
+      </w:r>
+      <w:r>
+        <w:rPr>
+          <w:i/>
+          <w:iCs/>
+        </w:rPr>
+        <w:t xml:space="preserve">Prochlorococcus</w:t>
+      </w:r>
+      <w:r>
+        <w:t xml:space="preserve"> </w:t>
+      </w:r>
+      <w:r>
+        <w:t xml:space="preserve">and</w:t>
+      </w:r>
+      <w:r>
+        <w:t xml:space="preserve"> </w:t>
+      </w:r>
+      <w:r>
+        <w:rPr>
+          <w:i/>
+          <w:iCs/>
+        </w:rPr>
+        <w:t xml:space="preserve">SAR11</w:t>
+      </w:r>
+      <w:r>
+        <w:t xml:space="preserve">. Community composition at our sampling depth below the deep chlorophyll maximum (DCM) was fairly typical of ALOHA, with a prokaryotic community dominated by SAR11, SAR282, and SAR 406, low levels of picoeukaryotes, and a microeukaryotic community equally distributed between diatoms, haptophytes, and dinoflagellates.</w:t>
+      </w:r>
+    </w:p>
+    <w:p>
+      <w:pPr>
+        <w:pStyle w:val="BodyText"/>
+      </w:pPr>
+      <w:r>
+        <w:t xml:space="preserve">Samples collected from 25 meters were well within the mixed layer and had PAR levels of 20-35% of the surface light while the 175 meter samples had a PAR level between 0.05 and 0.1%. Nitrate, nitrite, and ammonia data indicated that inorganic N was low in the surface (&lt;0.01 µM), while the deeper samples at 175 meters were collected in the middle of the nutricline, with a clear DCM at 125 meters, an ammonia maximum at 150 meters, and a nitrite max at 160-165 meters. Environmental nitrate concentrations were about 0.5 µM at 175 meters (Supplemental figure XX).</w:t>
+      </w:r>
+    </w:p>
+    <w:p>
+      <w:pPr>
+        <w:pStyle w:val="BodyText"/>
+      </w:pPr>
+      <w:r>
+        <w:t xml:space="preserve">We performed the incubations in succession, with the nitrate incubations first, followed by arginine, then guanosine monophosphate and finally ammonia. 6AM and 6PM data was always collected the same day and we alternated days between the surface and deep sampling depths to allow for reasonable sample processing times (Supplemental figure XX).</w:t>
+      </w:r>
+    </w:p>
+    <w:bookmarkStart w:id="28" w:name="X50c3d78adc27cd079dbc22d10d7944c6219b921"/>
     <w:p>
       <w:pPr>
         <w:pStyle w:val="Heading2"/>
@@ -465,18 +322,18 @@
           <wp:inline>
             <wp:extent cx="5334000" cy="3692769"/>
             <wp:effectExtent b="0" l="0" r="0" t="0"/>
-            <wp:docPr descr="" title="" id="25" name="Picture"/>
+            <wp:docPr descr="" title="" id="23" name="Picture"/>
             <a:graphic>
               <a:graphicData uri="http://schemas.openxmlformats.org/drawingml/2006/picture">
                 <pic:pic>
                   <pic:nvPicPr>
-                    <pic:cNvPr descr="figures/xamend_metab_gp.png" id="26" name="Picture"/>
+                    <pic:cNvPr descr="figures/xamend_metab_gp.png" id="24" name="Picture"/>
                     <pic:cNvPicPr>
                       <a:picLocks noChangeArrowheads="1" noChangeAspect="1"/>
                     </pic:cNvPicPr>
                   </pic:nvPicPr>
                   <pic:blipFill>
-                    <a:blip r:embed="rId24"/>
+                    <a:blip r:embed="rId22"/>
                     <a:stretch>
                       <a:fillRect/>
                     </a:stretch>
@@ -606,7 +463,7 @@
         <w:t xml:space="preserve">15</w:t>
       </w:r>
       <w:r>
-        <w:t xml:space="preserve">N labeled than their nucleobase constituents at T26 (22.9% and 42.1%, respectively), corresponding to the expected synthesis pathway. Guanine, however, had the inverse trend and at 44.9% labeled was 15% more labeled than guanosine (Supplemental figure XX). The deoxyribose forms were in all cases less completely labeled than their ribose counterparts (deoxycytidine = 18.9%, deoxyadenosine = 20.3%, and deoxyguanosine = 17.2%)</w:t>
+        <w:t xml:space="preserve">N labeled than their nucleobase derivatives at T26 (22.9% and 42.1%, respectively), corresponding to the expected synthesis pathway. Guanine, however, had the inverse trend with guanosine being 44.9% labeled while guanine was only 30% (Supplemental figure XX). The deoxyribose forms were in all cases less completely labeled than their ribose counterparts (deoxycytidine = 18.9%, deoxyadenosine = 20.3%, and deoxyguanosine = 17.2%)</w:t>
       </w:r>
       <w:r>
         <w:t xml:space="preserve"> </w:t>
@@ -623,6 +480,74 @@
         <w:commentReference w:id="0"/>
       </w:r>
       <w:r>
+        <w:t xml:space="preserve">. In each case, the fully</w:t>
+      </w:r>
+      <w:r>
+        <w:t xml:space="preserve"> </w:t>
+      </w:r>
+      <w:r>
+        <w:rPr>
+          <w:vertAlign w:val="superscript"/>
+        </w:rPr>
+        <w:t xml:space="preserve">15</w:t>
+      </w:r>
+      <w:r>
+        <w:t xml:space="preserve">N labeled nucleobase was the dominant constituent of the isotope envelope (</w:t>
+      </w:r>
+      <w:r>
+        <w:rPr>
+          <w:vertAlign w:val="superscript"/>
+        </w:rPr>
+        <w:t xml:space="preserve">15</w:t>
+      </w:r>
+      <w:r>
+        <w:t xml:space="preserve">N</w:t>
+      </w:r>
+      <w:r>
+        <w:rPr>
+          <w:vertAlign w:val="subscript"/>
+        </w:rPr>
+        <w:t xml:space="preserve">3</w:t>
+      </w:r>
+      <w:r>
+        <w:t xml:space="preserve"> </w:t>
+      </w:r>
+      <w:r>
+        <w:t xml:space="preserve">for cytosine and</w:t>
+      </w:r>
+      <w:r>
+        <w:t xml:space="preserve"> </w:t>
+      </w:r>
+      <w:r>
+        <w:rPr>
+          <w:vertAlign w:val="superscript"/>
+        </w:rPr>
+        <w:t xml:space="preserve">15</w:t>
+      </w:r>
+      <w:r>
+        <w:t xml:space="preserve">N</w:t>
+      </w:r>
+      <w:r>
+        <w:rPr>
+          <w:vertAlign w:val="subscript"/>
+        </w:rPr>
+        <w:t xml:space="preserve">5</w:t>
+      </w:r>
+      <w:r>
+        <w:t xml:space="preserve"> </w:t>
+      </w:r>
+      <w:r>
+        <w:t xml:space="preserve">for adenine and guanine).</w:t>
+      </w:r>
+    </w:p>
+    <w:p>
+      <w:pPr>
+        <w:pStyle w:val="BodyText"/>
+      </w:pPr>
+      <w:r>
+        <w:t xml:space="preserve">Other compounds, including betaines (here restricted to quaternary amines with a carboxylic acid group) and choline derivatives showed very little labeling at all, with only homarine (15.0% labeled)</w:t>
+      </w:r>
+      <w:r>
         <w:t xml:space="preserve"> </w:t>
       </w:r>
       <w:commentRangeStart w:id="0"/>
@@ -637,7 +562,15 @@
         <w:commentReference w:id="0"/>
       </w:r>
       <w:r>
-        <w:t xml:space="preserve">. In each case, the fully</w:t>
+        <w:t xml:space="preserve">` and O-acetylcarnitine (9.9% labeled) exceeding 5% labeling after 24 hours.</w:t>
+      </w:r>
+    </w:p>
+    <w:p>
+      <w:pPr>
+        <w:pStyle w:val="BodyText"/>
+      </w:pPr>
+      <w:r>
+        <w:t xml:space="preserve">Amendments with</w:t>
       </w:r>
       <w:r>
         <w:t xml:space="preserve"> </w:t>
@@ -649,7 +582,22 @@
         <w:t xml:space="preserve">15</w:t>
       </w:r>
       <w:r>
-        <w:t xml:space="preserve">N labeled nucleobase was the dominant constituent of the isotope envelope (</w:t>
+        <w:t xml:space="preserve">NO</w:t>
+      </w:r>
+      <w:r>
+        <w:rPr>
+          <w:vertAlign w:val="subscript"/>
+        </w:rPr>
+        <w:t xml:space="preserve">3</w:t>
+      </w:r>
+      <w:r>
+        <w:t xml:space="preserve"> </w:t>
+      </w:r>
+      <w:r>
+        <w:t xml:space="preserve">showed a significantly different labeling pattern with very few metabolites incorporating the</w:t>
+      </w:r>
+      <w:r>
+        <w:t xml:space="preserve"> </w:t>
       </w:r>
       <w:r>
         <w:rPr>
@@ -658,19 +606,72 @@
         <w:t xml:space="preserve">15</w:t>
       </w:r>
       <w:r>
+        <w:t xml:space="preserve">N label at the surface even after 24 hours. Glutamine and glutamate, which were labeled within 20 minutes from ammonia and are the main way in which inorganic nitrogen becomes organic, here saw only trace amounts of production from the added nitrate even after 24 hours. The most heavily labeled compound was guanine, which saw trace amounts of labeling at the T10 timepoint and reached ~40% labeling at T26. This labeling was not seen in the other nucleobases. The only group of compounds that did see compelling degrees of label incorporation were the mycosporine-like amino acids (MAAs), a group of compounds whose primary function is thought to be protection from UV light (see below). These compounds, like guanine, were labeled in excess of the bulk glutamate/amino acid pool from which their nitrogen is sourced. This is only possible if the nitrate is assimilated by a subset of the community whose glutamate is a small, isolated fraction of the total glutamate pool. Metabolites specific to those organisms can then be made from the small pool of heavily-labeled organic material with only a small influence on the fraction of glutamate or glutamine labeled in bulk.</w:t>
+      </w:r>
+    </w:p>
+    <w:p>
+      <w:pPr>
+        <w:pStyle w:val="BodyText"/>
+      </w:pPr>
+      <w:r>
+        <w:t xml:space="preserve">The organic nitrogen amendments also showed labeling patterns distinct from the ammonia incubations, though a large fraction of the nitrogen was clearly remineralized into ammonia/glutamate and used to label a similar suite of compounds (Figure 1). Fully C and N labeled (</w:t>
+      </w:r>
+      <w:r>
+        <w:rPr>
+          <w:vertAlign w:val="superscript"/>
+        </w:rPr>
+        <w:t xml:space="preserve">13</w:t>
+      </w:r>
+      <w:r>
+        <w:t xml:space="preserve">C</w:t>
+      </w:r>
+      <w:r>
+        <w:rPr>
+          <w:vertAlign w:val="subscript"/>
+        </w:rPr>
+        <w:t xml:space="preserve">6</w:t>
+      </w:r>
+      <w:r>
+        <w:t xml:space="preserve">,</w:t>
+      </w:r>
+      <w:r>
+        <w:t xml:space="preserve"> </w:t>
+      </w:r>
+      <w:r>
+        <w:rPr>
+          <w:vertAlign w:val="superscript"/>
+        </w:rPr>
+        <w:t xml:space="preserve">15</w:t>
+      </w:r>
+      <w:r>
         <w:t xml:space="preserve">N</w:t>
       </w:r>
       <w:r>
         <w:rPr>
           <w:vertAlign w:val="subscript"/>
         </w:rPr>
-        <w:t xml:space="preserve">3</w:t>
-      </w:r>
-      <w:r>
-        <w:t xml:space="preserve"> </w:t>
-      </w:r>
-      <w:r>
-        <w:t xml:space="preserve">for cytosine and</w:t>
+        <w:t xml:space="preserve">4</w:t>
+      </w:r>
+      <w:r>
+        <w:t xml:space="preserve">) arginine was visibly taken up at the T0 timepoint (within 20 minutes) and 80-90% of the pool was fully labeled after 12 hours. Surprisingly, the fraction of arginine labeled decreased from this point, with the T26 and T73 timepoints dropping to 73% and 46% labeled, respectively. This labeling rapidly propagated into citrulline via the urea cycle, indicating that labeled urea (</w:t>
+      </w:r>
+      <w:r>
+        <w:rPr>
+          <w:vertAlign w:val="superscript"/>
+        </w:rPr>
+        <w:t xml:space="preserve">13</w:t>
+      </w:r>
+      <w:r>
+        <w:t xml:space="preserve">C</w:t>
+      </w:r>
+      <w:r>
+        <w:rPr>
+          <w:vertAlign w:val="subscript"/>
+        </w:rPr>
+        <w:t xml:space="preserve">1</w:t>
+      </w:r>
+      <w:r>
+        <w:t xml:space="preserve">,</w:t>
       </w:r>
       <w:r>
         <w:t xml:space="preserve"> </w:t>
@@ -688,13 +689,264 @@
         <w:rPr>
           <w:vertAlign w:val="subscript"/>
         </w:rPr>
+        <w:t xml:space="preserve">2</w:t>
+      </w:r>
+      <w:r>
+        <w:t xml:space="preserve">) was created and available in the system as well though we were unable to measure this directly</w:t>
+      </w:r>
+      <w:r>
+        <w:t xml:space="preserve"> </w:t>
+      </w:r>
+      <w:commentRangeStart w:id="0"/>
+      <w:r>
+        <w:t xml:space="preserve"> </w:t>
+      </w:r>
+      <w:commentRangeEnd w:id="0"/>
+      <w:r>
+        <w:rPr>
+          <w:rStyle w:val="CommentReference"/>
+        </w:rPr>
+        <w:commentReference w:id="0"/>
+      </w:r>
+      <w:r>
+        <w:t xml:space="preserve">. Glutamate and glutamine were labeled much more slowly, reaching 10% labeled after 10 hours and a maximum of 66% labeled after 24 hours. Much of this nitrogen was then cycled very quickly among other compounds which also saw a jump in labeling at 24 hours. This was particularly true for other amino acids and the nucleobases/nucleosides and here, guanine was not labeled more than other nucleobases. Mycosporine-like amino acids and betaines were unlabeled above background even after 3 days of incubation.</w:t>
+      </w:r>
+    </w:p>
+    <w:p>
+      <w:pPr>
+        <w:pStyle w:val="BodyText"/>
+      </w:pPr>
+      <w:r>
+        <w:t xml:space="preserve">The guanosine monophosphate (GMP) incubations showed a pattern very similar to the arginine incubations in the identity, timing, and magnitude in which metabolites were labeled (Figure 1). While we were unable to measure GMP directly</w:t>
+      </w:r>
+      <w:r>
+        <w:t xml:space="preserve"> </w:t>
+      </w:r>
+      <w:commentRangeStart w:id="0"/>
+      <w:r>
+        <w:t xml:space="preserve"> </w:t>
+      </w:r>
+      <w:commentRangeEnd w:id="0"/>
+      <w:r>
+        <w:rPr>
+          <w:rStyle w:val="CommentReference"/>
+        </w:rPr>
+        <w:commentReference w:id="0"/>
+      </w:r>
+      <w:r>
+        <w:t xml:space="preserve"> </w:t>
+      </w:r>
+      <w:r>
+        <w:t xml:space="preserve">we saw clear labeling of fully C and N labeled guanosine (</w:t>
+      </w:r>
+      <w:r>
+        <w:rPr>
+          <w:vertAlign w:val="superscript"/>
+        </w:rPr>
+        <w:t xml:space="preserve">13</w:t>
+      </w:r>
+      <w:r>
+        <w:t xml:space="preserve">C</w:t>
+      </w:r>
+      <w:r>
+        <w:rPr>
+          <w:vertAlign w:val="subscript"/>
+        </w:rPr>
+        <w:t xml:space="preserve">10</w:t>
+      </w:r>
+      <w:r>
+        <w:t xml:space="preserve">,</w:t>
+      </w:r>
+      <w:r>
+        <w:t xml:space="preserve"> </w:t>
+      </w:r>
+      <w:r>
+        <w:rPr>
+          <w:vertAlign w:val="superscript"/>
+        </w:rPr>
+        <w:t xml:space="preserve">15</w:t>
+      </w:r>
+      <w:r>
+        <w:t xml:space="preserve">N</w:t>
+      </w:r>
+      <w:r>
+        <w:rPr>
+          <w:vertAlign w:val="subscript"/>
+        </w:rPr>
         <w:t xml:space="preserve">5</w:t>
       </w:r>
       <w:r>
-        <w:t xml:space="preserve"> </w:t>
-      </w:r>
-      <w:r>
-        <w:t xml:space="preserve">for adenine and guanine). Other compounds, including betaines (here restricted to quaternary amines with a carboxylic acid group) and choline derivatives showed very little labeling at all, with only homarine (15.0% labeled) and O-acetylcarnitine (9.9% labeled) exceeding 5% labeling after 24 hours</w:t>
+        <w:t xml:space="preserve">) after 3 hours that increased to a maximum of 75% after 24 hours before decreasing slightly to 64% labeled at the end of the three-day incubation. A small part of this signal was reflected in guanine, with</w:t>
+      </w:r>
+      <w:r>
+        <w:t xml:space="preserve"> </w:t>
+      </w:r>
+      <w:r>
+        <w:rPr>
+          <w:vertAlign w:val="superscript"/>
+        </w:rPr>
+        <w:t xml:space="preserve">13</w:t>
+      </w:r>
+      <w:r>
+        <w:t xml:space="preserve">C</w:t>
+      </w:r>
+      <w:r>
+        <w:rPr>
+          <w:vertAlign w:val="subscript"/>
+        </w:rPr>
+        <w:t xml:space="preserve">5</w:t>
+      </w:r>
+      <w:r>
+        <w:t xml:space="preserve">,</w:t>
+      </w:r>
+      <w:r>
+        <w:t xml:space="preserve"> </w:t>
+      </w:r>
+      <w:r>
+        <w:rPr>
+          <w:vertAlign w:val="superscript"/>
+        </w:rPr>
+        <w:t xml:space="preserve">15</w:t>
+      </w:r>
+      <w:r>
+        <w:t xml:space="preserve">N</w:t>
+      </w:r>
+      <w:r>
+        <w:rPr>
+          <w:vertAlign w:val="subscript"/>
+        </w:rPr>
+        <w:t xml:space="preserve">5</w:t>
+      </w:r>
+      <w:r>
+        <w:t xml:space="preserve"> </w:t>
+      </w:r>
+      <w:r>
+        <w:t xml:space="preserve">guanine representing about 10% of the signal at T3 and reaching a maximum of 40% at T26. At T26 we also saw extensive labeling in adenine, adenosine, and hypoxanthine though their dominant labeling patterns (</w:t>
+      </w:r>
+      <w:r>
+        <w:rPr>
+          <w:vertAlign w:val="superscript"/>
+        </w:rPr>
+        <w:t xml:space="preserve">13</w:t>
+      </w:r>
+      <w:r>
+        <w:t xml:space="preserve">C</w:t>
+      </w:r>
+      <w:r>
+        <w:rPr>
+          <w:vertAlign w:val="subscript"/>
+        </w:rPr>
+        <w:t xml:space="preserve">0</w:t>
+      </w:r>
+      <w:r>
+        <w:t xml:space="preserve"> </w:t>
+      </w:r>
+      <w:r>
+        <w:rPr>
+          <w:vertAlign w:val="superscript"/>
+        </w:rPr>
+        <w:t xml:space="preserve">15</w:t>
+      </w:r>
+      <w:r>
+        <w:t xml:space="preserve">N</w:t>
+      </w:r>
+      <w:r>
+        <w:rPr>
+          <w:vertAlign w:val="subscript"/>
+        </w:rPr>
+        <w:t xml:space="preserve">5</w:t>
+      </w:r>
+      <w:r>
+        <w:t xml:space="preserve">,</w:t>
+      </w:r>
+      <w:r>
+        <w:t xml:space="preserve"> </w:t>
+      </w:r>
+      <w:r>
+        <w:rPr>
+          <w:vertAlign w:val="superscript"/>
+        </w:rPr>
+        <w:t xml:space="preserve">13</w:t>
+      </w:r>
+      <w:r>
+        <w:t xml:space="preserve">C</w:t>
+      </w:r>
+      <w:r>
+        <w:rPr>
+          <w:vertAlign w:val="subscript"/>
+        </w:rPr>
+        <w:t xml:space="preserve">5</w:t>
+      </w:r>
+      <w:r>
+        <w:t xml:space="preserve"> </w:t>
+      </w:r>
+      <w:r>
+        <w:rPr>
+          <w:vertAlign w:val="superscript"/>
+        </w:rPr>
+        <w:t xml:space="preserve">15</w:t>
+      </w:r>
+      <w:r>
+        <w:t xml:space="preserve">N</w:t>
+      </w:r>
+      <w:r>
+        <w:rPr>
+          <w:vertAlign w:val="subscript"/>
+        </w:rPr>
+        <w:t xml:space="preserve">5</w:t>
+      </w:r>
+      <w:r>
+        <w:t xml:space="preserve">, and</w:t>
+      </w:r>
+      <w:r>
+        <w:t xml:space="preserve"> </w:t>
+      </w:r>
+      <w:r>
+        <w:rPr>
+          <w:vertAlign w:val="superscript"/>
+        </w:rPr>
+        <w:t xml:space="preserve">13</w:t>
+      </w:r>
+      <w:r>
+        <w:t xml:space="preserve">C</w:t>
+      </w:r>
+      <w:r>
+        <w:rPr>
+          <w:vertAlign w:val="subscript"/>
+        </w:rPr>
+        <w:t xml:space="preserve">0</w:t>
+      </w:r>
+      <w:r>
+        <w:t xml:space="preserve"> </w:t>
+      </w:r>
+      <w:r>
+        <w:rPr>
+          <w:vertAlign w:val="superscript"/>
+        </w:rPr>
+        <w:t xml:space="preserve">15</w:t>
+      </w:r>
+      <w:r>
+        <w:t xml:space="preserve">N</w:t>
+      </w:r>
+      <w:r>
+        <w:rPr>
+          <w:vertAlign w:val="subscript"/>
+        </w:rPr>
+        <w:t xml:space="preserve">4</w:t>
+      </w:r>
+      <w:r>
+        <w:t xml:space="preserve"> </w:t>
+      </w:r>
+      <w:r>
+        <w:t xml:space="preserve">respectively, Supplemental figure XX) suggested that the adenine and hypoxanthine were synthesized from glutamate and that the ribose pool had been swamped by guanosine cleavage. Here, unlike the arginine incubations, we also saw some MAA labeling at the end of the 3 day incubation.</w:t>
+      </w:r>
+    </w:p>
+    <w:p>
+      <w:pPr>
+        <w:pStyle w:val="BodyText"/>
+      </w:pPr>
+      <w:r>
+        <w:t xml:space="preserve">We also explored the degree of labeling incorporation into proteins by measuring the total hydrolyzable amino acids (THAAs) at both the start of each incubation and the end (Figure 2). Proteins were 30-50% of total particulate carbon pool (~2 µM) and 70-100% of the total particulate nitrogen (~0.25 µM), with free amino acids composing between 0.15% and 17% of the total THAA pool</w:t>
       </w:r>
       <w:commentRangeStart w:id="0"/>
       <w:r>
@@ -716,405 +968,7 @@
         <w:pStyle w:val="BodyText"/>
       </w:pPr>
       <w:r>
-        <w:t xml:space="preserve">Amendments with</w:t>
-      </w:r>
-      <w:r>
-        <w:t xml:space="preserve"> </w:t>
-      </w:r>
-      <w:r>
-        <w:rPr>
-          <w:vertAlign w:val="superscript"/>
-        </w:rPr>
-        <w:t xml:space="preserve">15</w:t>
-      </w:r>
-      <w:r>
-        <w:t xml:space="preserve">NO</w:t>
-      </w:r>
-      <w:r>
-        <w:rPr>
-          <w:vertAlign w:val="subscript"/>
-        </w:rPr>
-        <w:t xml:space="preserve">3</w:t>
-      </w:r>
-      <w:r>
-        <w:t xml:space="preserve"> </w:t>
-      </w:r>
-      <w:r>
-        <w:t xml:space="preserve">showed a significantly different labeling pattern with very few metabolites incorporating the</w:t>
-      </w:r>
-      <w:r>
-        <w:t xml:space="preserve"> </w:t>
-      </w:r>
-      <w:r>
-        <w:rPr>
-          <w:vertAlign w:val="superscript"/>
-        </w:rPr>
-        <w:t xml:space="preserve">15</w:t>
-      </w:r>
-      <w:r>
-        <w:t xml:space="preserve">N label at the surface even after 24 hours. Glutamine and glutamate, which were labeled within 20 minutes from ammonia and are the main way in which inorganic nitrogen becomes organic, here saw only trace amounts of production from the added nitrate even after 24 hours. The most heavily labeled compound was guanine, which saw trace amounts of labeling at the T10 timepoint and reached ~40% labeling at T26. This labeling was not reflected in the other nucleobases. The only group of compounds that did see compelling degrees of label were the mycosporine-like amino acids (MAAs), a group of compounds produced under UV exposure (see below). These compounds, like guanine, were labeled in excess of the bulk glutamate/amino acid pool from which their nitrogen is sourced. This is only possible if the nitrate is assimilated by a subset of the community that is able to reduce it and prevents it from entering the environment. Metabolites specific to those organisms can then be made from the small pool of heavily-labeled organic material without affecting the fraction of glutamate or glutamine labeled in bulk.</w:t>
-      </w:r>
-    </w:p>
-    <w:p>
-      <w:pPr>
-        <w:pStyle w:val="BodyText"/>
-      </w:pPr>
-      <w:r>
-        <w:t xml:space="preserve">The organic nitrogen amendments also showed labeling patterns distinct from the ammonia incubations, though a large fraction of the nitrogen was clearly remineralized into ammonia/glutamate and used to label a similar suite of compounds (Figure 1). Fully C and N labeled (</w:t>
-      </w:r>
-      <w:r>
-        <w:rPr>
-          <w:vertAlign w:val="superscript"/>
-        </w:rPr>
-        <w:t xml:space="preserve">13</w:t>
-      </w:r>
-      <w:r>
-        <w:t xml:space="preserve">C</w:t>
-      </w:r>
-      <w:r>
-        <w:rPr>
-          <w:vertAlign w:val="subscript"/>
-        </w:rPr>
-        <w:t xml:space="preserve">6</w:t>
-      </w:r>
-      <w:r>
-        <w:t xml:space="preserve">,</w:t>
-      </w:r>
-      <w:r>
-        <w:t xml:space="preserve"> </w:t>
-      </w:r>
-      <w:r>
-        <w:rPr>
-          <w:vertAlign w:val="superscript"/>
-        </w:rPr>
-        <w:t xml:space="preserve">15</w:t>
-      </w:r>
-      <w:r>
-        <w:t xml:space="preserve">N</w:t>
-      </w:r>
-      <w:r>
-        <w:rPr>
-          <w:vertAlign w:val="subscript"/>
-        </w:rPr>
-        <w:t xml:space="preserve">4</w:t>
-      </w:r>
-      <w:r>
-        <w:t xml:space="preserve">) arginine was visibly taken up at the T0 timepoint (within 20 minutes) and 80-90% of the pool was fully labeled after 12 hours. Surprisingly, the fraction of arginine labeled decreased from this point, with the T26 and T73 timepoints dropping to 73% and 46% labeled, respectively. This labeling rapidly propagated into citrulline via the urea cycle, indicating that labeled urea (</w:t>
-      </w:r>
-      <w:r>
-        <w:rPr>
-          <w:vertAlign w:val="superscript"/>
-        </w:rPr>
-        <w:t xml:space="preserve">13</w:t>
-      </w:r>
-      <w:r>
-        <w:t xml:space="preserve">C</w:t>
-      </w:r>
-      <w:r>
-        <w:rPr>
-          <w:vertAlign w:val="subscript"/>
-        </w:rPr>
-        <w:t xml:space="preserve">1</w:t>
-      </w:r>
-      <w:r>
-        <w:t xml:space="preserve">,</w:t>
-      </w:r>
-      <w:r>
-        <w:t xml:space="preserve"> </w:t>
-      </w:r>
-      <w:r>
-        <w:rPr>
-          <w:vertAlign w:val="superscript"/>
-        </w:rPr>
-        <w:t xml:space="preserve">15</w:t>
-      </w:r>
-      <w:r>
-        <w:t xml:space="preserve">N</w:t>
-      </w:r>
-      <w:r>
-        <w:rPr>
-          <w:vertAlign w:val="subscript"/>
-        </w:rPr>
-        <w:t xml:space="preserve">2</w:t>
-      </w:r>
-      <w:r>
-        <w:t xml:space="preserve">) was created and available in the system as well though we were unable to measure this directly</w:t>
-      </w:r>
-      <w:r>
-        <w:t xml:space="preserve"> </w:t>
-      </w:r>
-      <w:commentRangeStart w:id="0"/>
-      <w:r>
-        <w:t xml:space="preserve"> </w:t>
-      </w:r>
-      <w:commentRangeEnd w:id="0"/>
-      <w:r>
-        <w:rPr>
-          <w:rStyle w:val="CommentReference"/>
-        </w:rPr>
-        <w:commentReference w:id="0"/>
-      </w:r>
-      <w:r>
-        <w:t xml:space="preserve">. Glutamate and glutamine were labeled much more slowly, reaching 10% labeled after 10 hours and a maximum of 66% labeled after 24 hours. Much of this nitrogen was then cycled very quickly among other compounds which also saw a jump in labeling at 24 hours. This was particularly true for other amino acids and the nucleobases/nucleosides and here, guanine was not labeled more than other nucleobases. Mycosporine-like amino acids and betaines were unlabeled above background even after 3 days of incubation.</w:t>
-      </w:r>
-    </w:p>
-    <w:p>
-      <w:pPr>
-        <w:pStyle w:val="BodyText"/>
-      </w:pPr>
-      <w:r>
-        <w:t xml:space="preserve">The guanosine monophosphate (GMP) incubations showed a pattern very similar to the arginine incubations in the identity, timing, and magnitude in which metabolites were labeled (Figure 1). While we were unable to measure GMP directly</w:t>
-      </w:r>
-      <w:r>
-        <w:t xml:space="preserve"> </w:t>
-      </w:r>
-      <w:commentRangeStart w:id="0"/>
-      <w:r>
-        <w:t xml:space="preserve"> </w:t>
-      </w:r>
-      <w:commentRangeEnd w:id="0"/>
-      <w:r>
-        <w:rPr>
-          <w:rStyle w:val="CommentReference"/>
-        </w:rPr>
-        <w:commentReference w:id="0"/>
-      </w:r>
-      <w:r>
-        <w:t xml:space="preserve"> </w:t>
-      </w:r>
-      <w:r>
-        <w:t xml:space="preserve">we saw clear labeling of fully C and N labeled guanosine (</w:t>
-      </w:r>
-      <w:r>
-        <w:rPr>
-          <w:vertAlign w:val="superscript"/>
-        </w:rPr>
-        <w:t xml:space="preserve">13</w:t>
-      </w:r>
-      <w:r>
-        <w:t xml:space="preserve">C</w:t>
-      </w:r>
-      <w:r>
-        <w:rPr>
-          <w:vertAlign w:val="subscript"/>
-        </w:rPr>
-        <w:t xml:space="preserve">10</w:t>
-      </w:r>
-      <w:r>
-        <w:t xml:space="preserve">,</w:t>
-      </w:r>
-      <w:r>
-        <w:t xml:space="preserve"> </w:t>
-      </w:r>
-      <w:r>
-        <w:rPr>
-          <w:vertAlign w:val="superscript"/>
-        </w:rPr>
-        <w:t xml:space="preserve">15</w:t>
-      </w:r>
-      <w:r>
-        <w:t xml:space="preserve">N</w:t>
-      </w:r>
-      <w:r>
-        <w:rPr>
-          <w:vertAlign w:val="subscript"/>
-        </w:rPr>
-        <w:t xml:space="preserve">5</w:t>
-      </w:r>
-      <w:r>
-        <w:t xml:space="preserve">) after 3 hours that increased to a maximum of 75% after 24 hours before decreasing slightly to 64% labeled at the end of the three-day incubation. A small part of this signal was reflected in guanine, with</w:t>
-      </w:r>
-      <w:r>
-        <w:t xml:space="preserve"> </w:t>
-      </w:r>
-      <w:r>
-        <w:rPr>
-          <w:vertAlign w:val="superscript"/>
-        </w:rPr>
-        <w:t xml:space="preserve">13</w:t>
-      </w:r>
-      <w:r>
-        <w:t xml:space="preserve">C</w:t>
-      </w:r>
-      <w:r>
-        <w:rPr>
-          <w:vertAlign w:val="subscript"/>
-        </w:rPr>
-        <w:t xml:space="preserve">5</w:t>
-      </w:r>
-      <w:r>
-        <w:t xml:space="preserve">,</w:t>
-      </w:r>
-      <w:r>
-        <w:t xml:space="preserve"> </w:t>
-      </w:r>
-      <w:r>
-        <w:rPr>
-          <w:vertAlign w:val="superscript"/>
-        </w:rPr>
-        <w:t xml:space="preserve">15</w:t>
-      </w:r>
-      <w:r>
-        <w:t xml:space="preserve">N</w:t>
-      </w:r>
-      <w:r>
-        <w:rPr>
-          <w:vertAlign w:val="subscript"/>
-        </w:rPr>
-        <w:t xml:space="preserve">5</w:t>
-      </w:r>
-      <w:r>
-        <w:t xml:space="preserve"> </w:t>
-      </w:r>
-      <w:r>
-        <w:t xml:space="preserve">guanine representing about 10% of the signal at T3 and reaching a maximum of 40% at T26. At T26 we also saw extensive labeling in adenine, adenosine, and hypoxanthine though their dominant labeling patterns (</w:t>
-      </w:r>
-      <w:r>
-        <w:rPr>
-          <w:vertAlign w:val="superscript"/>
-        </w:rPr>
-        <w:t xml:space="preserve">13</w:t>
-      </w:r>
-      <w:r>
-        <w:t xml:space="preserve">C</w:t>
-      </w:r>
-      <w:r>
-        <w:rPr>
-          <w:vertAlign w:val="subscript"/>
-        </w:rPr>
-        <w:t xml:space="preserve">0</w:t>
-      </w:r>
-      <w:r>
-        <w:t xml:space="preserve"> </w:t>
-      </w:r>
-      <w:r>
-        <w:rPr>
-          <w:vertAlign w:val="superscript"/>
-        </w:rPr>
-        <w:t xml:space="preserve">15</w:t>
-      </w:r>
-      <w:r>
-        <w:t xml:space="preserve">N</w:t>
-      </w:r>
-      <w:r>
-        <w:rPr>
-          <w:vertAlign w:val="subscript"/>
-        </w:rPr>
-        <w:t xml:space="preserve">5</w:t>
-      </w:r>
-      <w:r>
-        <w:t xml:space="preserve">,</w:t>
-      </w:r>
-      <w:r>
-        <w:t xml:space="preserve"> </w:t>
-      </w:r>
-      <w:r>
-        <w:rPr>
-          <w:vertAlign w:val="superscript"/>
-        </w:rPr>
-        <w:t xml:space="preserve">13</w:t>
-      </w:r>
-      <w:r>
-        <w:t xml:space="preserve">C</w:t>
-      </w:r>
-      <w:r>
-        <w:rPr>
-          <w:vertAlign w:val="subscript"/>
-        </w:rPr>
-        <w:t xml:space="preserve">5</w:t>
-      </w:r>
-      <w:r>
-        <w:t xml:space="preserve"> </w:t>
-      </w:r>
-      <w:r>
-        <w:rPr>
-          <w:vertAlign w:val="superscript"/>
-        </w:rPr>
-        <w:t xml:space="preserve">15</w:t>
-      </w:r>
-      <w:r>
-        <w:t xml:space="preserve">N</w:t>
-      </w:r>
-      <w:r>
-        <w:rPr>
-          <w:vertAlign w:val="subscript"/>
-        </w:rPr>
-        <w:t xml:space="preserve">5</w:t>
-      </w:r>
-      <w:r>
-        <w:t xml:space="preserve">, and</w:t>
-      </w:r>
-      <w:r>
-        <w:t xml:space="preserve"> </w:t>
-      </w:r>
-      <w:r>
-        <w:rPr>
-          <w:vertAlign w:val="superscript"/>
-        </w:rPr>
-        <w:t xml:space="preserve">13</w:t>
-      </w:r>
-      <w:r>
-        <w:t xml:space="preserve">C</w:t>
-      </w:r>
-      <w:r>
-        <w:rPr>
-          <w:vertAlign w:val="subscript"/>
-        </w:rPr>
-        <w:t xml:space="preserve">0</w:t>
-      </w:r>
-      <w:r>
-        <w:t xml:space="preserve"> </w:t>
-      </w:r>
-      <w:r>
-        <w:rPr>
-          <w:vertAlign w:val="superscript"/>
-        </w:rPr>
-        <w:t xml:space="preserve">15</w:t>
-      </w:r>
-      <w:r>
-        <w:t xml:space="preserve">N</w:t>
-      </w:r>
-      <w:r>
-        <w:rPr>
-          <w:vertAlign w:val="subscript"/>
-        </w:rPr>
-        <w:t xml:space="preserve">4</w:t>
-      </w:r>
-      <w:r>
-        <w:t xml:space="preserve"> </w:t>
-      </w:r>
-      <w:r>
-        <w:t xml:space="preserve">respectively, Supplemental figure XX) suggested that the adenine and hypoxanthine were synthesized from glutamate and that the ribose pool had been swamped by guanosine cleavage. Here, unlike the arginine incubations, we also saw some MAA labeling at the end of the 3 day incubation.</w:t>
-      </w:r>
-    </w:p>
-    <w:p>
-      <w:pPr>
-        <w:pStyle w:val="BodyText"/>
-      </w:pPr>
-      <w:r>
-        <w:t xml:space="preserve">We also explored the degree of labeling incorporation into proteins by measuring the total hydrolyzable amino acids (THAAs) at both the start of each incubation and the end (Figure 2). Proteins were 30-50% of total particulate carbon pool (~2 uM) and 70-100% of the total particulate nitrogen (~0.25 uM), with free amino acids composing between 0.15% and 17% of the total</w:t>
-      </w:r>
-      <w:commentRangeStart w:id="0"/>
-      <w:r>
-        <w:t xml:space="preserve"> </w:t>
-      </w:r>
-      <w:commentRangeEnd w:id="0"/>
-      <w:r>
-        <w:rPr>
-          <w:rStyle w:val="CommentReference"/>
-        </w:rPr>
-        <w:commentReference w:id="0"/>
-      </w:r>
-      <w:r>
-        <w:t xml:space="preserve">`.</w:t>
-      </w:r>
-    </w:p>
-    <w:p>
-      <w:pPr>
-        <w:pStyle w:val="BodyText"/>
-      </w:pPr>
-      <w:r>
-        <w:t xml:space="preserve">There were differences in THAA labeling patterns between the amendments (Figure 2). Despite their shorter incubation time (26 hours vs 73 hours), the inorganic nitrogen amendments generally higher fractions of labeled protein. The nitrate amendments in particular were surprisingly heavily labeled given the minimal signal seen in the free metabolites, with a degree of labeling exceeding the ammonia incubation. This indicates that most of the assimilation was done by the small subset of organisms able to reduce nitrate and use it for growth and that these organisms did not share the reduced nitrogen with the rest of the community</w:t>
+        <w:t xml:space="preserve">There were differences in THAA labeling patterns between the amendments (Figure 2). Despite their shorter incubation time (26 hours vs 73 hours), the inorganic nitrogen amendments generally had higher fractions of labeled protein. The nitrate amendments in particular were surprisingly heavily labeled given the minimal signal seen in the free metabolites, with a degree of labeling exceeding the ammonia incubation. This indicates that most of the assimilation was done by the small subset of organisms able to reduce nitrate and use it for growth and that these organisms did not share the reduced nitrogen with the rest of the community</w:t>
       </w:r>
       <w:commentRangeStart w:id="0"/>
       <w:r>
@@ -1140,18 +994,18 @@
           <wp:inline>
             <wp:extent cx="5334000" cy="3692769"/>
             <wp:effectExtent b="0" l="0" r="0" t="0"/>
-            <wp:docPr descr="" title="" id="28" name="Picture"/>
+            <wp:docPr descr="" title="" id="26" name="Picture"/>
             <a:graphic>
               <a:graphicData uri="http://schemas.openxmlformats.org/drawingml/2006/picture">
                 <pic:pic>
                   <pic:nvPicPr>
-                    <pic:cNvPr descr="figures/total_thaa_gp.png" id="29" name="Picture"/>
+                    <pic:cNvPr descr="figures/total_thaa_gp.png" id="27" name="Picture"/>
                     <pic:cNvPicPr>
                       <a:picLocks noChangeArrowheads="1" noChangeAspect="1"/>
                     </pic:cNvPicPr>
                   </pic:nvPicPr>
                   <pic:blipFill>
-                    <a:blip r:embed="rId27"/>
+                    <a:blip r:embed="rId25"/>
                     <a:stretch>
                       <a:fillRect/>
                     </a:stretch>
@@ -1187,7 +1041,7 @@
           <w:i/>
           <w:iCs/>
         </w:rPr>
-        <w:t xml:space="preserve">Figure 2: Stacked bar plots showing the fraction of various total hydrolyzable amino acids (THAAs) labeled at the end of the incubations across the four amendments. Total uM nitrogen (N) in the protein pool is shown in the top plot while the fraction of individual amino acids labeled is shown in the rows below. Colors denote specific labeling patterns detected in the THAAs.</w:t>
+        <w:t xml:space="preserve">Figure 2: Stacked bar plots showing the fraction of various total hydrolyzable amino acids (THAAs) labeled at the end of the incubations across the four amendments. Total µM nitrogen (N) in the protein pool is shown in the top plot while the fraction of individual amino acids labeled is shown in the rows below. Colors denote specific labeling patterns detected in the THAAs.</w:t>
       </w:r>
     </w:p>
     <w:p>
@@ -1360,14 +1214,14 @@
         <w:t xml:space="preserve">labeling, likely from erythrose 4-phosphate via the pentose phosphate pathway indicating new synthesis through shikimate with nitrogen addition from a heavily labeled glutamate pool again.</w:t>
       </w:r>
     </w:p>
-    <w:bookmarkEnd w:id="30"/>
-    <w:bookmarkStart w:id="34" w:name="X7d08ec4adfba59cca1744e62bd7bab995db7486"/>
+    <w:bookmarkEnd w:id="28"/>
+    <w:bookmarkStart w:id="32" w:name="Xecac4ed2279096f92057c9a11002f35116717da"/>
     <w:p>
       <w:pPr>
         <w:pStyle w:val="Heading2"/>
       </w:pPr>
       <w:r>
-        <w:t xml:space="preserve">Minimal diel signal observed except in the UV-reactive mycosporine-like amino acids</w:t>
+        <w:t xml:space="preserve">Minimal diel signal observed except in the UV-absorbing mycosporine-like amino acids</w:t>
       </w:r>
     </w:p>
     <w:p>
@@ -1375,7 +1229,7 @@
         <w:pStyle w:val="FirstParagraph"/>
       </w:pPr>
       <w:r>
-        <w:t xml:space="preserve">We performed the four nitrogen amendments at both 6AM and at 6PM to test for any diel effects in labeling patterns. Very few compounds showed a significant difference between the 6AM start time and the 6PM start time with the exception being the mycosporine-like amino acids (MAAs, Figure 3). Shinorine and palythine were confirmed via MS</w:t>
+        <w:t xml:space="preserve">We performed experiments with each of the 4 forms of nitrogen at both 6AM and at 6PM to test for any diel effects in labeling patterns. Very few compounds showed a significant difference between the 6AM start time and the 6PM start time with the exception being the mycosporine-like amino acids (MAAs, Figure 3). Shinorine and palythine were confirmed via MS</w:t>
       </w:r>
       <w:r>
         <w:rPr>
@@ -1447,7 +1301,7 @@
         <w:t xml:space="preserve"> </w:t>
       </w:r>
       <w:r>
-        <w:t xml:space="preserve">of 285.1445 possibly corresponding to palythene and usujirene.</w:t>
+        <w:t xml:space="preserve">of 285.1445 likely corresponding to palythene and usujirene.</w:t>
       </w:r>
     </w:p>
     <w:p>
@@ -1459,18 +1313,18 @@
           <wp:inline>
             <wp:extent cx="2752374" cy="5504749"/>
             <wp:effectExtent b="0" l="0" r="0" t="0"/>
-            <wp:docPr descr="" title="" id="32" name="Picture"/>
+            <wp:docPr descr="" title="" id="30" name="Picture"/>
             <a:graphic>
               <a:graphicData uri="http://schemas.openxmlformats.org/drawingml/2006/picture">
                 <pic:pic>
                   <pic:nvPicPr>
-                    <pic:cNvPr descr="figures/MAA_curves.png" id="33" name="Picture"/>
+                    <pic:cNvPr descr="figures/MAA_curves.png" id="31" name="Picture"/>
                     <pic:cNvPicPr>
                       <a:picLocks noChangeArrowheads="1" noChangeAspect="1"/>
                     </pic:cNvPicPr>
                   </pic:nvPicPr>
                   <pic:blipFill>
-                    <a:blip r:embed="rId31"/>
+                    <a:blip r:embed="rId29"/>
                     <a:stretch>
                       <a:fillRect/>
                     </a:stretch>
@@ -1506,7 +1360,51 @@
           <w:i/>
           <w:iCs/>
         </w:rPr>
-        <w:t xml:space="preserve">Figure 3: Fraction of UV-reactive mycosporine-like amino acids (MAAs) containing at least one 15N label over one day during the treatments amended with 15N labeled ammonia or nitrate. Incubations started at 6AM are shown in yellow while incubations started at 6PM are shown in blue, with grey background regions highlighting nighttime. Three replicates are included at each of the 5 timepoints and best-fit power law curves have been fit behind the data.</w:t>
+        <w:t xml:space="preserve">Figure 3: Fraction of UV-absorbing mycosporine-like amino acids (MAAs) containing at least one</w:t>
+      </w:r>
+      <w:r>
+        <w:rPr>
+          <w:i/>
+          <w:iCs/>
+        </w:rPr>
+        <w:t xml:space="preserve"> </w:t>
+      </w:r>
+      <w:r>
+        <w:rPr>
+          <w:i/>
+          <w:iCs/>
+          <w:vertAlign w:val="superscript"/>
+        </w:rPr>
+        <w:t xml:space="preserve">15</w:t>
+      </w:r>
+      <w:r>
+        <w:rPr>
+          <w:i/>
+          <w:iCs/>
+        </w:rPr>
+        <w:t xml:space="preserve">N label over one day during the treatments amended with</w:t>
+      </w:r>
+      <w:r>
+        <w:rPr>
+          <w:i/>
+          <w:iCs/>
+        </w:rPr>
+        <w:t xml:space="preserve"> </w:t>
+      </w:r>
+      <w:r>
+        <w:rPr>
+          <w:i/>
+          <w:iCs/>
+          <w:vertAlign w:val="superscript"/>
+        </w:rPr>
+        <w:t xml:space="preserve">15</w:t>
+      </w:r>
+      <w:r>
+        <w:rPr>
+          <w:i/>
+          <w:iCs/>
+        </w:rPr>
+        <w:t xml:space="preserve">N labeled ammonia or nitrate. Incubations started at 6AM are shown in yellow while incubations started at 6PM are shown in blue, with grey background regions highlighting nighttime. Three replicates are included at each of the 5 timepoints and best-fit power law curves have been fit behind the data.</w:t>
       </w:r>
     </w:p>
     <w:p>
@@ -1517,8 +1415,8 @@
         <w:t xml:space="preserve">Nitrate data showed similar degrees of labeling which was again surprising given the reduced amount of bulk metabolite labeling in those amendments, though the synthesis of MAAs from nitrate appeared less clearly diel. Shinorine and porphyra-334 were particularly well-labeled under nitrate, approaching the values achieved in the ammonia incubations. Very little MAA labeling was observed during the arginine and GMP amendments until the 73 hour timepoint, though at that point the fraction labeled was approximately equivalent to the inorganic amendments and slightly higher for GMP than arginine.</w:t>
       </w:r>
     </w:p>
-    <w:bookmarkEnd w:id="34"/>
-    <w:bookmarkStart w:id="38" w:name="Xf8cfc5d50d613d7c6f6f8fcdc1a03d0bfc75491"/>
+    <w:bookmarkEnd w:id="32"/>
+    <w:bookmarkStart w:id="36" w:name="Xf8cfc5d50d613d7c6f6f8fcdc1a03d0bfc75491"/>
     <w:p>
       <w:pPr>
         <w:pStyle w:val="Heading2"/>
@@ -1573,7 +1471,7 @@
         <w:t xml:space="preserve">15</w:t>
       </w:r>
       <w:r>
-        <w:t xml:space="preserve">N aspartate was undetectable until T3 and</w:t>
+        <w:t xml:space="preserve">N aspartate was undetectable until hour 3 of the incubation and</w:t>
       </w:r>
       <w:r>
         <w:t xml:space="preserve"> </w:t>
@@ -1585,7 +1483,7 @@
         <w:t xml:space="preserve">15</w:t>
       </w:r>
       <w:r>
-        <w:t xml:space="preserve">N asparagine never detected. In contrast, glutamine labeling was similar between the two depths, with the fraction labeled 10-20 percentage points higher at the surface across all timepoints; a trend which was clearly not propagated to glutamate or other amino acids and instead must have represented accumulation or protein incorporation.</w:t>
+        <w:t xml:space="preserve">N asparagine was never detected. In contrast, glutamine labeling was similar between the two depths, with the fraction labeled 10-20 percentage points higher at the surface across all timepoints; a trend which was clearly not propagated to glutamate or other amino acids and instead must have represented accumulation or protein incorporation.</w:t>
       </w:r>
       <w:r>
         <w:t xml:space="preserve"> </w:t>
@@ -1611,18 +1509,18 @@
           <wp:inline>
             <wp:extent cx="5334000" cy="5334000"/>
             <wp:effectExtent b="0" l="0" r="0" t="0"/>
-            <wp:docPr descr="" title="" id="36" name="Picture"/>
+            <wp:docPr descr="" title="" id="34" name="Picture"/>
             <a:graphic>
               <a:graphicData uri="http://schemas.openxmlformats.org/drawingml/2006/picture">
                 <pic:pic>
                   <pic:nvPicPr>
-                    <pic:cNvPr descr="figures/deep_vs_surf_labeling.png" id="37" name="Picture"/>
+                    <pic:cNvPr descr="figures/deep_vs_surf_labeling.png" id="35" name="Picture"/>
                     <pic:cNvPicPr>
                       <a:picLocks noChangeArrowheads="1" noChangeAspect="1"/>
                     </pic:cNvPicPr>
                   </pic:nvPicPr>
                   <pic:blipFill>
-                    <a:blip r:embed="rId35"/>
+                    <a:blip r:embed="rId33"/>
                     <a:stretch>
                       <a:fillRect/>
                     </a:stretch>
@@ -1666,7 +1564,7 @@
         <w:pStyle w:val="BodyText"/>
       </w:pPr>
       <w:r>
-        <w:t xml:space="preserve">Other metabolites varied in their degree of labeling (Figure 4). Nucleobases and nucleosides were much more heavily labeled from ammonia at the surface, with maximum labeling 3-10 times more extensive around T3 and T10 if the isotope was measurable at both depths and infinitely more so if not. Betaines and other nitrogen-containing metabolites, however, were almost entirely unlabeled at 175 meters until the 24 hour mark, at which the fraction labeled in both was 5-20 times higher at the surface. An important exception to this rule is the osmolyte ectoine, an aspartate derivative that nonetheless was synthesized with nitrogen from ammonia at depth at rates equal to or exceeding those of the surface.</w:t>
+        <w:t xml:space="preserve">Other metabolites varied in their degree of labeling (Figure 4). Nucleobases and nucleosides were much more heavily labeled from ammonia at the surface, with maximum labeling 3-10 times more extensive around T3 and T10 if the isotope was measurable at both depths and infinitely more so if not. Betaines and other nitrogen-containing metabolites, however, were almost entirely unlabeled at 175 meters until the 24 hour mark, at which time the fraction labeled in both was 5-20 times higher at the surface. An important exception to this rule is the osmolyte ectoine, an aspartate derivative that nonetheless was synthesized with nitrogen from ammonia at depth at rates equal to or exceeding those of the surface.</w:t>
       </w:r>
     </w:p>
     <w:p>
@@ -1674,7 +1572,7 @@
         <w:pStyle w:val="BodyText"/>
       </w:pPr>
       <w:r>
-        <w:t xml:space="preserve">We were unfortunately unable to present the data collected from the 175 meter labeled nitrate incubations here due to missed timepoints and confusion during sample collection but the raw numbers are provided in the supplement (Table XX and Supplemental Figure XX).</w:t>
+        <w:t xml:space="preserve">We were unfortunately unable to present the data collected from the 175 meter labeled nitrate incubations here due to missed timepoints and our inability to confidently connect data to the correct timepoint for those samples but the raw numbers are provided in the supplement (Supplemental Figure XX).</w:t>
       </w:r>
     </w:p>
     <w:p>
@@ -1691,8 +1589,8 @@
         <w:t xml:space="preserve">N use from the organic nitrogen substrates was again strikingly similar between the 25 meter and 175 meter samples aside from the direct products of the amended compounds. In both cases, uptake and use of the labeled substrate was equal or slightly higher at depth for a majority of the metabolites measured. Exceptions to this were theanine, which was 20-30 percentage points more heavily labeled at the surface by the end of the incubations, and ectoine, which was synthesized more at depth even to a larger degree than it was during the ammonia treatments, reaching nearly 50 percentage points more labeled at 175 meters than it was at 25m.</w:t>
       </w:r>
     </w:p>
-    <w:bookmarkEnd w:id="38"/>
-    <w:bookmarkStart w:id="42" w:name="X8b566f000a898a0bef4f530b2a380969e4e03f1"/>
+    <w:bookmarkEnd w:id="36"/>
+    <w:bookmarkStart w:id="40" w:name="X8b566f000a898a0bef4f530b2a380969e4e03f1"/>
     <w:p>
       <w:pPr>
         <w:pStyle w:val="Heading2"/>
@@ -2082,7 +1980,7 @@
         <w:pStyle w:val="BodyText"/>
       </w:pPr>
       <w:r>
-        <w:t xml:space="preserve">To derive biological meaning from the untargeted analysis, we performed a k-means clustering of the features across all the treatments and timepoints and included our targeted data in the clustering. Clear patterns of isotope incorporation emerged in 6 of the 10 clusters we used (Figure 5). Cluster 1, the largest with 64 molecular features, contained many of the unlabeled compounds including those without any nitrogen and all of the betaines. Cluster 2 contained most of the amino acids, the nucleobases cytosine and guanine, the and the deoxynucleosides as well as ectoine and citrulline. Cluster 3 contained homarine, beta-alanine, and O-acetylcarnitine as well as the remaining amino acids aside from aspartate, glutamate, and glutamine which fell into cluster 4. Known compounds in cluster 5 consisted of adenine, adenosine, cytidine, and hypoxanthine while guanosine fell alone into cluster 6. The MAAs were distributed across clusters 8 and 9, while clusters 7 and 10 had no known compounds.</w:t>
+        <w:t xml:space="preserve">To derive biological meaning from the untargeted analysis, we performed a k-means clustering of the features across all the treatments and timepoints and included our targeted data in the clustering. Clear patterns of isotope incorporation emerged in 6 of the 10 clusters we used (Figure 5). Cluster 1, the largest with 64 molecular features, contained many of the unlabeled compounds including those without any nitrogen and all of the betaines. Cluster 2 contained most of the amino acids, the nucleobases cytosine and guanine, and the deoxynucleosides as well as ectoine and citrulline. Cluster 3 contained homarine, beta-alanine, and O-acetylcarnitine as well as the remaining amino acids aside from aspartate, glutamate, and glutamine which fell into cluster 4. Known compounds in cluster 5 consisted of adenine, adenosine, cytidine, and hypoxanthine while guanosine fell alone into cluster 6. The MAAs were distributed across clusters 8 and 9, while clusters 7 and 10 had no known compounds.</w:t>
       </w:r>
     </w:p>
     <w:p>
@@ -2094,18 +1992,18 @@
           <wp:inline>
             <wp:extent cx="5334000" cy="3282461"/>
             <wp:effectExtent b="0" l="0" r="0" t="0"/>
-            <wp:docPr descr="" title="" id="40" name="Picture"/>
+            <wp:docPr descr="" title="" id="38" name="Picture"/>
             <a:graphic>
               <a:graphicData uri="http://schemas.openxmlformats.org/drawingml/2006/picture">
                 <pic:pic>
                   <pic:nvPicPr>
-                    <pic:cNvPr descr="figures/untarg_heatmap.png" id="41" name="Picture"/>
+                    <pic:cNvPr descr="figures/untarg_heatmap.png" id="39" name="Picture"/>
                     <pic:cNvPicPr>
                       <a:picLocks noChangeArrowheads="1" noChangeAspect="1"/>
                     </pic:cNvPicPr>
                   </pic:nvPicPr>
                   <pic:blipFill>
-                    <a:blip r:embed="rId39"/>
+                    <a:blip r:embed="rId37"/>
                     <a:stretch>
                       <a:fillRect/>
                     </a:stretch>
@@ -2166,15 +2064,247 @@
         <w:t xml:space="preserve">N label during the surface seawater amendments with various substrates after the number of hours shown on the x-axis. Darker colors indicate a larger percentage of the feature signal was isotopically labeled. Three biological replicates are stacked vertically at each timepoint and the labeling within each clusters has been averaged across all the composing features. The number of features in each cluster is specified by the n in the facet name. GMP = guanosine monophosphate.</w:t>
       </w:r>
     </w:p>
+    <w:bookmarkEnd w:id="40"/>
+    <w:bookmarkEnd w:id="41"/>
+    <w:bookmarkStart w:id="42" w:name="discussion"/>
+    <w:p>
+      <w:pPr>
+        <w:pStyle w:val="Heading1"/>
+      </w:pPr>
+      <w:r>
+        <w:t xml:space="preserve">Discussion</w:t>
+      </w:r>
+    </w:p>
+    <w:p>
+      <w:pPr>
+        <w:pStyle w:val="Compact"/>
+        <w:numPr>
+          <w:ilvl w:val="0"/>
+          <w:numId w:val="1001"/>
+        </w:numPr>
+      </w:pPr>
+      <w:r>
+        <w:t xml:space="preserve">Discuss community progression through diatom bloom over the course of the experiments</w:t>
+      </w:r>
+    </w:p>
+    <w:p>
+      <w:pPr>
+        <w:pStyle w:val="Compact"/>
+        <w:numPr>
+          <w:ilvl w:val="1"/>
+          <w:numId w:val="1002"/>
+        </w:numPr>
+      </w:pPr>
+      <w:r>
+        <w:t xml:space="preserve">What do we know about Hemiaulus</w:t>
+      </w:r>
+    </w:p>
+    <w:p>
+      <w:pPr>
+        <w:pStyle w:val="Compact"/>
+        <w:numPr>
+          <w:ilvl w:val="1"/>
+          <w:numId w:val="1002"/>
+        </w:numPr>
+      </w:pPr>
+      <w:r>
+        <w:t xml:space="preserve">Both Pro and heterotrophic bacteria were elevated from typical St. ALOHA conditions by the end</w:t>
+      </w:r>
+    </w:p>
+    <w:p>
+      <w:pPr>
+        <w:pStyle w:val="Compact"/>
+        <w:numPr>
+          <w:ilvl w:val="1"/>
+          <w:numId w:val="1002"/>
+        </w:numPr>
+      </w:pPr>
+      <w:r>
+        <w:t xml:space="preserve">Deep data impossible to know because I only have one 175m depth profile for IFCB/ASV data but looks pretty typical</w:t>
+      </w:r>
+    </w:p>
+    <w:p>
+      <w:pPr>
+        <w:pStyle w:val="Compact"/>
+        <w:numPr>
+          <w:ilvl w:val="0"/>
+          <w:numId w:val="1001"/>
+        </w:numPr>
+      </w:pPr>
+      <w:r>
+        <w:t xml:space="preserve">Surprising nitrate response, expected a lot more metabolite labeling</w:t>
+      </w:r>
+    </w:p>
+    <w:p>
+      <w:pPr>
+        <w:pStyle w:val="Compact"/>
+        <w:numPr>
+          <w:ilvl w:val="1"/>
+          <w:numId w:val="1003"/>
+        </w:numPr>
+      </w:pPr>
+      <w:r>
+        <w:t xml:space="preserve">Surface community not</w:t>
+      </w:r>
+      <w:r>
+        <w:t xml:space="preserve"> </w:t>
+      </w:r>
+      <w:r>
+        <w:t xml:space="preserve">“expecting”</w:t>
+      </w:r>
+      <w:r>
+        <w:t xml:space="preserve"> </w:t>
+      </w:r>
+      <w:r>
+        <w:t xml:space="preserve">nitrate? problems with redox at surface? Diatom growth only?</w:t>
+      </w:r>
+    </w:p>
+    <w:p>
+      <w:pPr>
+        <w:pStyle w:val="Compact"/>
+        <w:numPr>
+          <w:ilvl w:val="0"/>
+          <w:numId w:val="1001"/>
+        </w:numPr>
+      </w:pPr>
+      <w:r>
+        <w:t xml:space="preserve">Not expecting to see any C labeling from the organics via CO2 because inorganic C pool is so much larger, unlike the N pool</w:t>
+      </w:r>
+    </w:p>
+    <w:p>
+      <w:pPr>
+        <w:pStyle w:val="Compact"/>
+        <w:numPr>
+          <w:ilvl w:val="1"/>
+          <w:numId w:val="1004"/>
+        </w:numPr>
+      </w:pPr>
+      <w:r>
+        <w:t xml:space="preserve">Discuss how badly we swamped the pool of nitrate, ammonia, DON, arg, GMP</w:t>
+      </w:r>
+    </w:p>
+    <w:p>
+      <w:pPr>
+        <w:pStyle w:val="Compact"/>
+        <w:numPr>
+          <w:ilvl w:val="0"/>
+          <w:numId w:val="1001"/>
+        </w:numPr>
+      </w:pPr>
+      <w:r>
+        <w:t xml:space="preserve">What does the decrease in arginine labeling in +Arg at T26 and T73 indicate? Pulse-chase behavior? How is the labeled pool specifically decreasing?</w:t>
+      </w:r>
+    </w:p>
+    <w:p>
+      <w:pPr>
+        <w:pStyle w:val="Compact"/>
+        <w:numPr>
+          <w:ilvl w:val="0"/>
+          <w:numId w:val="1001"/>
+        </w:numPr>
+      </w:pPr>
+      <w:r>
+        <w:t xml:space="preserve">Contrasting the THAA +Nit with the metabolites hints at a small but rapidly churning amino acid pool that’s deeply segregated</w:t>
+      </w:r>
+    </w:p>
+    <w:p>
+      <w:pPr>
+        <w:pStyle w:val="Compact"/>
+        <w:numPr>
+          <w:ilvl w:val="0"/>
+          <w:numId w:val="1001"/>
+        </w:numPr>
+      </w:pPr>
+      <w:r>
+        <w:t xml:space="preserve">MAAs are mostly made from the 4DG core plus N-containing amino acids (glycine). How does the labeling of these compare to their substituent AAs? (it’s much larger)</w:t>
+      </w:r>
+    </w:p>
+    <w:p>
+      <w:pPr>
+        <w:pStyle w:val="Compact"/>
+        <w:numPr>
+          <w:ilvl w:val="0"/>
+          <w:numId w:val="1001"/>
+        </w:numPr>
+      </w:pPr>
+      <w:r>
+        <w:t xml:space="preserve">Ectoine - mention that it’s mostly bacterial</w:t>
+      </w:r>
+      <w:r>
+        <w:t xml:space="preserve"> </w:t>
+      </w:r>
+      <w:r>
+        <w:t xml:space="preserve">[@McParland2021]</w:t>
+      </w:r>
+    </w:p>
+    <w:p>
+      <w:pPr>
+        <w:pStyle w:val="Compact"/>
+        <w:numPr>
+          <w:ilvl w:val="0"/>
+          <w:numId w:val="1001"/>
+        </w:numPr>
+      </w:pPr>
+      <w:r>
+        <w:t xml:space="preserve">Incubations are imperfect metrics of the actual environment because amendments with</w:t>
+      </w:r>
+      <w:r>
+        <w:t xml:space="preserve"> </w:t>
+      </w:r>
+      <w:r>
+        <w:rPr>
+          <w:i/>
+          <w:iCs/>
+        </w:rPr>
+        <w:t xml:space="preserve">anything</w:t>
+      </w:r>
+      <w:r>
+        <w:t xml:space="preserve"> </w:t>
+      </w:r>
+      <w:r>
+        <w:t xml:space="preserve">will heavily skew the community - over what time scale though?</w:t>
+      </w:r>
+      <w:r>
+        <w:t xml:space="preserve"> </w:t>
+      </w:r>
+      <w:r>
+        <w:t xml:space="preserve">[@Eppley1977; @Shilova2017; @Karl2017; @Rii2018]</w:t>
+      </w:r>
+    </w:p>
+    <w:p>
+      <w:pPr>
+        <w:pStyle w:val="FirstParagraph"/>
+      </w:pPr>
+      <w:r>
+        <w:t xml:space="preserve">Comments from Anitra:</w:t>
+      </w:r>
+    </w:p>
+    <w:p>
+      <w:pPr>
+        <w:pStyle w:val="BodyText"/>
+      </w:pPr>
+      <w:r>
+        <w:t xml:space="preserve">0.3nM glutamine becoming 0.8nM means that 95% of the 0.8nM was produced, not counting all the N that went through glutamine into other things. Do you know what typically happens to biomass during ALOHA + DIN incubation? How does this compare to measures of regenerated production? (Was this increase a result of more biomass or just higher gln concentrations?)</w:t>
+      </w:r>
+    </w:p>
     <w:bookmarkEnd w:id="42"/>
+    <w:bookmarkStart w:id="43" w:name="conclusion"/>
+    <w:p>
+      <w:pPr>
+        <w:pStyle w:val="Heading1"/>
+      </w:pPr>
+      <w:r>
+        <w:t xml:space="preserve">Conclusion</w:t>
+      </w:r>
+    </w:p>
     <w:bookmarkEnd w:id="43"/>
-    <w:bookmarkStart w:id="44" w:name="discussion"/>
+    <w:bookmarkStart w:id="44" w:name="methods"/>
     <w:p>
       <w:pPr>
         <w:pStyle w:val="Heading1"/>
       </w:pPr>
       <w:r>
-        <w:t xml:space="preserve">Discussion</w:t>
+        <w:t xml:space="preserve">Methods</w:t>
       </w:r>
     </w:p>
     <w:p>
@@ -2182,144 +2312,72 @@
         <w:pStyle w:val="FirstParagraph"/>
       </w:pPr>
       <w:r>
-        <w:t xml:space="preserve">[DISCUSSION: surface community not</w:t>
-      </w:r>
-      <w:r>
-        <w:t xml:space="preserve"> </w:t>
-      </w:r>
-      <w:r>
-        <w:t xml:space="preserve">“expecting”</w:t>
-      </w:r>
-      <w:r>
-        <w:t xml:space="preserve"> </w:t>
-      </w:r>
-      <w:r>
-        <w:t xml:space="preserve">nitrate? problems with redox at surface?]</w:t>
-      </w:r>
-    </w:p>
-    <w:p>
-      <w:pPr>
-        <w:pStyle w:val="BodyText"/>
-      </w:pPr>
-      <w:r>
-        <w:t xml:space="preserve">[DISCUSSION: not expecting to see any C labeling from the organics via CO2 because inorganic C pool is so much larger, unlike the N pool]</w:t>
-      </w:r>
-    </w:p>
-    <w:p>
-      <w:pPr>
-        <w:pStyle w:val="BodyText"/>
-      </w:pPr>
-      <w:r>
-        <w:t xml:space="preserve">[DISCUSSION: What does the decrease in arginine labeling in +Arg at T26 and T73 indicate? Pulse-chase behavior? How is the labeled pool specifically decreasing?]</w:t>
-      </w:r>
-    </w:p>
-    <w:p>
-      <w:pPr>
-        <w:pStyle w:val="BodyText"/>
-      </w:pPr>
-      <w:r>
-        <w:t xml:space="preserve">[DISCUSSION: Contrasting the THAA +Nit with the metabolites hints at a small but rapidly churning amino acid pool that’s deeply segregated]</w:t>
-      </w:r>
-    </w:p>
-    <w:p>
-      <w:pPr>
-        <w:pStyle w:val="BodyText"/>
-      </w:pPr>
-      <w:r>
-        <w:t xml:space="preserve">[DISCUSSION: MAAs are mostly made from the 4DG core plus N-containing amino acids (glycine). How does the labeling of these compare to their substituent AAs? (it’s much larger)]</w:t>
+        <w:t xml:space="preserve">[explain chromatographic similarity scoring as pearson’s correlation coefficient]</w:t>
       </w:r>
     </w:p>
     <w:bookmarkEnd w:id="44"/>
-    <w:bookmarkStart w:id="45" w:name="conclusion"/>
+    <w:bookmarkStart w:id="45" w:name="acknowledgements"/>
     <w:p>
       <w:pPr>
         <w:pStyle w:val="Heading1"/>
       </w:pPr>
       <w:r>
-        <w:t xml:space="preserve">Conclusion</w:t>
+        <w:t xml:space="preserve">Acknowledgements</w:t>
       </w:r>
     </w:p>
     <w:bookmarkEnd w:id="45"/>
-    <w:bookmarkStart w:id="46" w:name="methods"/>
+    <w:bookmarkStart w:id="46" w:name="data-availability"/>
     <w:p>
       <w:pPr>
         <w:pStyle w:val="Heading1"/>
       </w:pPr>
       <w:r>
-        <w:t xml:space="preserve">Methods</w:t>
-      </w:r>
-    </w:p>
-    <w:p>
-      <w:pPr>
-        <w:pStyle w:val="FirstParagraph"/>
-      </w:pPr>
-      <w:r>
-        <w:t xml:space="preserve">[explain chromatographic similarity scoring as pearson’s correlation coefficient]</w:t>
+        <w:t xml:space="preserve">Data availability</w:t>
       </w:r>
     </w:p>
     <w:bookmarkEnd w:id="46"/>
-    <w:bookmarkStart w:id="47" w:name="acknowledgements"/>
+    <w:bookmarkStart w:id="48" w:name="references"/>
     <w:p>
       <w:pPr>
         <w:pStyle w:val="Heading1"/>
       </w:pPr>
       <w:r>
-        <w:t xml:space="preserve">Acknowledgements</w:t>
-      </w:r>
-    </w:p>
+        <w:t xml:space="preserve">References</w:t>
+      </w:r>
+    </w:p>
+    <w:bookmarkStart w:id="47" w:name="refs"/>
     <w:bookmarkEnd w:id="47"/>
-    <w:bookmarkStart w:id="48" w:name="data-availability"/>
+    <w:bookmarkEnd w:id="48"/>
+    <w:bookmarkStart w:id="51" w:name="supplement"/>
     <w:p>
       <w:pPr>
         <w:pStyle w:val="Heading1"/>
       </w:pPr>
       <w:r>
-        <w:t xml:space="preserve">Data availability</w:t>
-      </w:r>
-    </w:p>
-    <w:bookmarkEnd w:id="48"/>
-    <w:bookmarkStart w:id="50" w:name="references"/>
-    <w:p>
-      <w:pPr>
-        <w:pStyle w:val="Heading1"/>
-      </w:pPr>
-      <w:r>
-        <w:t xml:space="preserve">References</w:t>
-      </w:r>
-    </w:p>
-    <w:bookmarkStart w:id="49" w:name="refs"/>
+        <w:t xml:space="preserve">Supplement</w:t>
+      </w:r>
+    </w:p>
+    <w:bookmarkStart w:id="49" w:name="X031c7b21c251fbda3e788800498d52242f55fbd"/>
+    <w:p>
+      <w:pPr>
+        <w:pStyle w:val="Heading2"/>
+      </w:pPr>
+      <w:r>
+        <w:t xml:space="preserve">Supp fig: full heatmap of all compounds and timepoints</w:t>
+      </w:r>
+    </w:p>
     <w:bookmarkEnd w:id="49"/>
+    <w:bookmarkStart w:id="50" w:name="X8af38d15bed8b30cb36c0256c59cd2dc670d021"/>
+    <w:p>
+      <w:pPr>
+        <w:pStyle w:val="Heading2"/>
+      </w:pPr>
+      <w:r>
+        <w:t xml:space="preserve">Supp fig: THAA labeling broken down by triplicate</w:t>
+      </w:r>
+    </w:p>
     <w:bookmarkEnd w:id="50"/>
-    <w:bookmarkStart w:id="53" w:name="supplement"/>
-    <w:p>
-      <w:pPr>
-        <w:pStyle w:val="Heading1"/>
-      </w:pPr>
-      <w:r>
-        <w:t xml:space="preserve">Supplement</w:t>
-      </w:r>
-    </w:p>
-    <w:bookmarkStart w:id="51" w:name="X031c7b21c251fbda3e788800498d52242f55fbd"/>
-    <w:p>
-      <w:pPr>
-        <w:pStyle w:val="Heading2"/>
-      </w:pPr>
-      <w:r>
-        <w:t xml:space="preserve">Supp fig: full heatmap of all compounds and timepoints</w:t>
-      </w:r>
-    </w:p>
     <w:bookmarkEnd w:id="51"/>
-    <w:bookmarkStart w:id="52" w:name="X8af38d15bed8b30cb36c0256c59cd2dc670d021"/>
-    <w:p>
-      <w:pPr>
-        <w:pStyle w:val="Heading2"/>
-      </w:pPr>
-      <w:r>
-        <w:t xml:space="preserve">Supp fig: THAA labeling broken down by triplicate</w:t>
-      </w:r>
-    </w:p>
-    <w:bookmarkEnd w:id="52"/>
-    <w:bookmarkEnd w:id="53"/>
     <w:sectPr/>
   </w:body>
 </w:document>
@@ -2327,7 +2385,7 @@
 
 <file path=word/comments.xml><?xml version="1.0" encoding="utf-8"?>
 <w:comments xmlns:w="http://schemas.openxmlformats.org/wordprocessingml/2006/main" xmlns:m="http://schemas.openxmlformats.org/officeDocument/2006/math" xmlns:r="http://schemas.openxmlformats.org/officeDocument/2006/relationships" xmlns:o="urn:schemas-microsoft-com:office:office" xmlns:v="urn:schemas-microsoft-com:vml" xmlns:w10="urn:schemas-microsoft-com:office:word" xmlns:a="http://schemas.openxmlformats.org/drawingml/2006/main" xmlns:pic="http://schemas.openxmlformats.org/drawingml/2006/picture" xmlns:wp="http://schemas.openxmlformats.org/drawingml/2006/wordprocessingDrawing">
-  <w:comment w:id="0" w:author="Will" w:date="2025-05-23 13:48:30.643307">
+  <w:comment w:id="0" w:author="Will" w:date="2025-05-29 14:32:37.223822">
     <w:p>
       <w:pPr>
         <w:pStyle w:val="CommentText"/>
@@ -2339,23 +2397,11 @@
         <w:annotationRef/>
       </w:r>
       <w:r>
-        <w:t xml:space="preserve">Do I need a</w:t>
-      </w:r>
-      <w:r>
-        <w:t xml:space="preserve"> </w:t>
-      </w:r>
-      <w:r>
-        <w:t xml:space="preserve">‘here’s what the cruise looked like’</w:t>
-      </w:r>
-      <w:r>
-        <w:t xml:space="preserve"> </w:t>
-      </w:r>
-      <w:r>
-        <w:t xml:space="preserve">results section?</w:t>
+        <w:t xml:space="preserve">Consider trying harder to get thymine/uracil/inosine values?</w:t>
       </w:r>
     </w:p>
   </w:comment>
-  <w:comment w:id="0" w:author="Will" w:date="2025-05-23 13:48:30.697468">
+  <w:comment w:id="0" w:author="Will" w:date="2025-05-29 14:32:37.247798">
     <w:p>
       <w:pPr>
         <w:pStyle w:val="CommentText"/>
@@ -2367,11 +2413,11 @@
         <w:annotationRef/>
       </w:r>
       <w:r>
-        <w:t xml:space="preserve">Maybe better as a small table?</w:t>
+        <w:t xml:space="preserve">double check these numbers after rerun</w:t>
       </w:r>
     </w:p>
   </w:comment>
-  <w:comment w:id="0" w:author="Will" w:date="2025-05-23 13:48:30.698033">
+  <w:comment w:id="0" w:author="Will" w:date="2025-05-29 14:32:37.257289">
     <w:p>
       <w:pPr>
         <w:pStyle w:val="CommentText"/>
@@ -2383,11 +2429,11 @@
         <w:annotationRef/>
       </w:r>
       <w:r>
-        <w:t xml:space="preserve">Consider trying harder to get thymine/uracil/inosine values?</w:t>
+        <w:t xml:space="preserve">I could try harder to get urea values for this but it’s pretty bad.</w:t>
       </w:r>
     </w:p>
   </w:comment>
-  <w:comment w:id="0" w:author="Will" w:date="2025-05-23 13:48:30.698522">
+  <w:comment w:id="0" w:author="Will" w:date="2025-05-29 14:32:37.266815">
     <w:p>
       <w:pPr>
         <w:pStyle w:val="CommentText"/>
@@ -2399,11 +2445,11 @@
         <w:annotationRef/>
       </w:r>
       <w:r>
-        <w:t xml:space="preserve">Expand betaine discussion and turn it into a separate paragraph? Not sure what more to say… fluxes?</w:t>
+        <w:t xml:space="preserve">I can try harder here but the data is pretty bad :(</w:t>
       </w:r>
     </w:p>
   </w:comment>
-  <w:comment w:id="0" w:author="Will" w:date="2025-05-23 13:48:30.707946">
+  <w:comment w:id="0" w:author="Will" w:date="2025-05-29 14:32:37.276102">
     <w:p>
       <w:pPr>
         <w:pStyle w:val="CommentText"/>
@@ -2415,11 +2461,11 @@
         <w:annotationRef/>
       </w:r>
       <w:r>
-        <w:t xml:space="preserve">I could try harder to get urea values for this but it’s pretty bad.</w:t>
+        <w:t xml:space="preserve">I’m not really sure what to say here or how to dive into the variance that’s of interest to us. Report the compound with the most/least in protein? Break it down by labeled vs unlabeled?</w:t>
       </w:r>
     </w:p>
   </w:comment>
-  <w:comment w:id="0" w:author="Will" w:date="2025-05-23 13:48:30.717175">
+  <w:comment w:id="0" w:author="Will" w:date="2025-05-29 14:32:37.276633">
     <w:p>
       <w:pPr>
         <w:pStyle w:val="CommentText"/>
@@ -2431,11 +2477,11 @@
         <w:annotationRef/>
       </w:r>
       <w:r>
-        <w:t xml:space="preserve">I can try harder here but the data is pretty bad :(</w:t>
+        <w:t xml:space="preserve">Is this something for the discussion instead?</w:t>
       </w:r>
     </w:p>
   </w:comment>
-  <w:comment w:id="0" w:author="Will" w:date="2025-05-23 13:48:30.726105">
+  <w:comment w:id="0" w:author="Will" w:date="2025-05-29 14:32:37.294145">
     <w:p>
       <w:pPr>
         <w:pStyle w:val="CommentText"/>
@@ -2447,11 +2493,11 @@
         <w:annotationRef/>
       </w:r>
       <w:r>
-        <w:t xml:space="preserve">I’m not really sure what to say here or how to dive into the variance that’s of interest to us. Report the compound with the most/least in protein? Break it down by labeled vs unlabeled?</w:t>
+        <w:t xml:space="preserve">double-check this after rerun</w:t>
       </w:r>
     </w:p>
   </w:comment>
-  <w:comment w:id="0" w:author="Will" w:date="2025-05-23 13:48:30.726611">
+  <w:comment w:id="0" w:author="Will" w:date="2025-05-29 14:32:37.312773">
     <w:p>
       <w:pPr>
         <w:pStyle w:val="CommentText"/>
@@ -2463,11 +2509,11 @@
         <w:annotationRef/>
       </w:r>
       <w:r>
-        <w:t xml:space="preserve">Is this something for the discussion instead?</w:t>
+        <w:t xml:space="preserve">Maybe find and include the light level at 175m?</w:t>
       </w:r>
     </w:p>
   </w:comment>
-  <w:comment w:id="0" w:author="Will" w:date="2025-05-23 13:48:30.748765">
+  <w:comment w:id="0" w:author="Will" w:date="2025-05-29 14:32:37.313323">
     <w:p>
       <w:pPr>
         <w:pStyle w:val="CommentText"/>
@@ -2479,11 +2525,32 @@
         <w:annotationRef/>
       </w:r>
       <w:r>
-        <w:t xml:space="preserve">double-check this after rerun</w:t>
+        <w:t xml:space="preserve">Not super happy with the numeric language here - feels like I’m flipping between</w:t>
+      </w:r>
+      <w:r>
+        <w:t xml:space="preserve"> </w:t>
+      </w:r>
+      <w:r>
+        <w:t xml:space="preserve">‘times greater’</w:t>
+      </w:r>
+      <w:r>
+        <w:t xml:space="preserve"> </w:t>
+      </w:r>
+      <w:r>
+        <w:t xml:space="preserve">and</w:t>
+      </w:r>
+      <w:r>
+        <w:t xml:space="preserve"> </w:t>
+      </w:r>
+      <w:r>
+        <w:t xml:space="preserve">‘percentage points higher’</w:t>
+      </w:r>
+      <w:r>
+        <w:t xml:space="preserve">.</w:t>
       </w:r>
     </w:p>
   </w:comment>
-  <w:comment w:id="0" w:author="Will" w:date="2025-05-23 13:48:30.766295">
+  <w:comment w:id="0" w:author="Will" w:date="2025-05-29 14:32:37.338944">
     <w:p>
       <w:pPr>
         <w:pStyle w:val="CommentText"/>
@@ -2495,64 +2562,11 @@
         <w:annotationRef/>
       </w:r>
       <w:r>
-        <w:t xml:space="preserve">Maybe find and include the light level at 175m?</w:t>
+        <w:t xml:space="preserve">when a large proportion of junk was coming off the column (median retention times between 14.0 and 14.5 minutes)? during the retention time when sulfate eluted? based on their peak shape and retention time? due to the fact that they showed no change across any of the treatments or timepoints? The darn things just look bad and I hate them but I can’t really explain why.</w:t>
       </w:r>
     </w:p>
   </w:comment>
-  <w:comment w:id="0" w:author="Will" w:date="2025-05-23 13:48:30.766831">
-    <w:p>
-      <w:pPr>
-        <w:pStyle w:val="CommentText"/>
-      </w:pPr>
-      <w:r>
-        <w:rPr>
-          <w:rStyle w:val="CommentReference"/>
-        </w:rPr>
-        <w:annotationRef/>
-      </w:r>
-      <w:r>
-        <w:t xml:space="preserve">Not super happy with the numeric language here - feels like I’m flipping between</w:t>
-      </w:r>
-      <w:r>
-        <w:t xml:space="preserve"> </w:t>
-      </w:r>
-      <w:r>
-        <w:t xml:space="preserve">‘times greater’</w:t>
-      </w:r>
-      <w:r>
-        <w:t xml:space="preserve"> </w:t>
-      </w:r>
-      <w:r>
-        <w:t xml:space="preserve">and</w:t>
-      </w:r>
-      <w:r>
-        <w:t xml:space="preserve"> </w:t>
-      </w:r>
-      <w:r>
-        <w:t xml:space="preserve">‘percentage points higher’</w:t>
-      </w:r>
-      <w:r>
-        <w:t xml:space="preserve">.</w:t>
-      </w:r>
-    </w:p>
-  </w:comment>
-  <w:comment w:id="0" w:author="Will" w:date="2025-05-23 13:48:30.792845">
-    <w:p>
-      <w:pPr>
-        <w:pStyle w:val="CommentText"/>
-      </w:pPr>
-      <w:r>
-        <w:rPr>
-          <w:rStyle w:val="CommentReference"/>
-        </w:rPr>
-        <w:annotationRef/>
-      </w:r>
-      <w:r>
-        <w:t xml:space="preserve">when a large proportion of junk was coming off the column (median retention times between 14.0 and 14.5 minutes)? during the retention time when sulfate eluted? based on their peak shape and retention time? due to the fact that they showed no change across any of the treatments or timepoints? The darn things just look bad and I hate them but I can’t really explain why.</w:t>
-      </w:r>
-    </w:p>
-  </w:comment>
-  <w:comment w:id="0" w:author="Will" w:date="2025-05-23 13:48:30.801815">
+  <w:comment w:id="0" w:author="Will" w:date="2025-05-29 14:32:37.348063">
     <w:p>
       <w:pPr>
         <w:pStyle w:val="CommentText"/>
@@ -2778,6 +2792,12 @@
     <w:abstractNumId w:val="991"/>
   </w:num>
   <w:num w:numId="1002">
+    <w:abstractNumId w:val="991"/>
+  </w:num>
+  <w:num w:numId="1003">
+    <w:abstractNumId w:val="991"/>
+  </w:num>
+  <w:num w:numId="1004">
     <w:abstractNumId w:val="991"/>
   </w:num>
 </w:numbering>

</xml_diff>

<commit_message>
Adding THAA data as a table for Anitra
</commit_message>
<xml_diff>
--- a/manuscript/manuscript.docx
+++ b/manuscript/manuscript.docx
@@ -913,15 +913,1082 @@
         <w:pStyle w:val="BodyText"/>
       </w:pPr>
       <w:r>
-        <w:t xml:space="preserve">We also explored the degree of labeling incorporation into proteins by measuring the total hydrolyzable amino acids (THAAs) at both the start of each incubation and the end (Figure 3). THAAs come from protein (which can be in living biomass or detritus) and include minor contributions from metabolites and peptides with hydrolyzable amino acid moieties (e.g. MAAs and glutathione).</w:t>
-      </w:r>
-    </w:p>
+        <w:t xml:space="preserve">We also explored the degree of labeling incorporation into proteins by measuring the total hydrolyzable amino acids (THAAs) at both the start of each incubation and the end (Figure 3). THAAs come from protein (which can be in living biomass or detritus) and include minor contributions from metabolites and peptides with hydrolyzable amino acid moieties (e.g. MAAs and glutathione). THAAs were 26% (±6.5%, SD, n=24) of the total surface particulate carbon pool (PC = 2.84 µM in mixed layer) at T0 and 55% (±14.3%, SD, n=24) of the particulate nitrogen (PN = 0.36 µM in mixed layer) at the start of the incubations. Free amino acids composed between 0.2% and 14% of the total hydrolyzable fractions with the highest contributions from free glutamate (Table 1).</w:t>
+      </w:r>
+    </w:p>
+    <w:tbl>
+      <w:tblPr>
+        <w:tblStyle w:val="Table"/>
+        <w:tblW w:type="pct" w:w="5000"/>
+        <w:tblLayout w:type="fixed"/>
+        <w:tblLook w:firstRow="1" w:lastRow="0" w:firstColumn="0" w:lastColumn="0" w:noHBand="0" w:noVBand="0" w:val="0020"/>
+      </w:tblPr>
+      <w:tblGrid>
+        <w:gridCol w:w="1840"/>
+        <w:gridCol w:w="800"/>
+        <w:gridCol w:w="800"/>
+        <w:gridCol w:w="960"/>
+        <w:gridCol w:w="240"/>
+        <w:gridCol w:w="1040"/>
+        <w:gridCol w:w="1040"/>
+        <w:gridCol w:w="1200"/>
+      </w:tblGrid>
+      <w:tr>
+        <w:trPr>
+          <w:tblHeader w:val="on"/>
+        </w:trPr>
+        <w:tc>
+          <w:tcPr/>
+          <w:p>
+            <w:pPr>
+              <w:pStyle w:val="Compact"/>
+              <w:jc w:val="left"/>
+            </w:pPr>
+            <w:r>
+              <w:t xml:space="preserve">Amino acid</w:t>
+            </w:r>
+          </w:p>
+        </w:tc>
+        <w:tc>
+          <w:tcPr/>
+          <w:p>
+            <w:pPr>
+              <w:pStyle w:val="Compact"/>
+              <w:jc w:val="right"/>
+            </w:pPr>
+            <w:r>
+              <w:t xml:space="preserve">THAA (T0)</w:t>
+            </w:r>
+          </w:p>
+        </w:tc>
+        <w:tc>
+          <w:tcPr/>
+          <w:p>
+            <w:pPr>
+              <w:pStyle w:val="Compact"/>
+              <w:jc w:val="right"/>
+            </w:pPr>
+            <w:r>
+              <w:t xml:space="preserve">Free (T0)</w:t>
+            </w:r>
+          </w:p>
+        </w:tc>
+        <w:tc>
+          <w:tcPr/>
+          <w:p>
+            <w:pPr>
+              <w:pStyle w:val="Compact"/>
+              <w:jc w:val="right"/>
+            </w:pPr>
+            <w:r>
+              <w:t xml:space="preserve">% free (T0)</w:t>
+            </w:r>
+          </w:p>
+        </w:tc>
+        <w:tc>
+          <w:tcPr/>
+          <w:p>
+            <w:pPr>
+              <w:pStyle w:val="Compact"/>
+            </w:pPr>
+          </w:p>
+        </w:tc>
+        <w:tc>
+          <w:tcPr/>
+          <w:p>
+            <w:pPr>
+              <w:pStyle w:val="Compact"/>
+              <w:jc w:val="right"/>
+            </w:pPr>
+            <w:r>
+              <w:t xml:space="preserve">THAA (final)</w:t>
+            </w:r>
+          </w:p>
+        </w:tc>
+        <w:tc>
+          <w:tcPr/>
+          <w:p>
+            <w:pPr>
+              <w:pStyle w:val="Compact"/>
+              <w:jc w:val="right"/>
+            </w:pPr>
+            <w:r>
+              <w:t xml:space="preserve">Free (final)</w:t>
+            </w:r>
+          </w:p>
+        </w:tc>
+        <w:tc>
+          <w:tcPr/>
+          <w:p>
+            <w:pPr>
+              <w:pStyle w:val="Compact"/>
+              <w:jc w:val="right"/>
+            </w:pPr>
+            <w:r>
+              <w:t xml:space="preserve">% free (final)</w:t>
+            </w:r>
+          </w:p>
+        </w:tc>
+      </w:tr>
+      <w:tr>
+        <w:tc>
+          <w:tcPr/>
+          <w:p>
+            <w:pPr>
+              <w:pStyle w:val="Compact"/>
+              <w:jc w:val="left"/>
+            </w:pPr>
+            <w:r>
+              <w:t xml:space="preserve">Glutamate + glutamine</w:t>
+            </w:r>
+          </w:p>
+        </w:tc>
+        <w:tc>
+          <w:tcPr/>
+          <w:p>
+            <w:pPr>
+              <w:pStyle w:val="Compact"/>
+              <w:jc w:val="right"/>
+            </w:pPr>
+            <w:r>
+              <w:t xml:space="preserve">19.57</w:t>
+            </w:r>
+          </w:p>
+        </w:tc>
+        <w:tc>
+          <w:tcPr/>
+          <w:p>
+            <w:pPr>
+              <w:pStyle w:val="Compact"/>
+              <w:jc w:val="right"/>
+            </w:pPr>
+            <w:r>
+              <w:t xml:space="preserve">1.66</w:t>
+            </w:r>
+          </w:p>
+        </w:tc>
+        <w:tc>
+          <w:tcPr/>
+          <w:p>
+            <w:pPr>
+              <w:pStyle w:val="Compact"/>
+              <w:jc w:val="right"/>
+            </w:pPr>
+            <w:r>
+              <w:t xml:space="preserve">8.47</w:t>
+            </w:r>
+          </w:p>
+        </w:tc>
+        <w:tc>
+          <w:tcPr/>
+          <w:p>
+            <w:pPr>
+              <w:pStyle w:val="Compact"/>
+            </w:pPr>
+          </w:p>
+        </w:tc>
+        <w:tc>
+          <w:tcPr/>
+          <w:p>
+            <w:pPr>
+              <w:pStyle w:val="Compact"/>
+              <w:jc w:val="right"/>
+            </w:pPr>
+            <w:r>
+              <w:t xml:space="preserve">29.41</w:t>
+            </w:r>
+          </w:p>
+        </w:tc>
+        <w:tc>
+          <w:tcPr/>
+          <w:p>
+            <w:pPr>
+              <w:pStyle w:val="Compact"/>
+              <w:jc w:val="right"/>
+            </w:pPr>
+            <w:r>
+              <w:t xml:space="preserve">4.04</w:t>
+            </w:r>
+          </w:p>
+        </w:tc>
+        <w:tc>
+          <w:tcPr/>
+          <w:p>
+            <w:pPr>
+              <w:pStyle w:val="Compact"/>
+              <w:jc w:val="right"/>
+            </w:pPr>
+            <w:r>
+              <w:t xml:space="preserve">13.72</w:t>
+            </w:r>
+          </w:p>
+        </w:tc>
+      </w:tr>
+      <w:tr>
+        <w:tc>
+          <w:tcPr/>
+          <w:p>
+            <w:pPr>
+              <w:pStyle w:val="Compact"/>
+              <w:jc w:val="left"/>
+            </w:pPr>
+            <w:r>
+              <w:t xml:space="preserve">Histidine</w:t>
+            </w:r>
+          </w:p>
+        </w:tc>
+        <w:tc>
+          <w:tcPr/>
+          <w:p>
+            <w:pPr>
+              <w:pStyle w:val="Compact"/>
+              <w:jc w:val="right"/>
+            </w:pPr>
+            <w:r>
+              <w:t xml:space="preserve">2.53</w:t>
+            </w:r>
+          </w:p>
+        </w:tc>
+        <w:tc>
+          <w:tcPr/>
+          <w:p>
+            <w:pPr>
+              <w:pStyle w:val="Compact"/>
+              <w:jc w:val="right"/>
+            </w:pPr>
+            <w:r>
+              <w:t xml:space="preserve">0.04</w:t>
+            </w:r>
+          </w:p>
+        </w:tc>
+        <w:tc>
+          <w:tcPr/>
+          <w:p>
+            <w:pPr>
+              <w:pStyle w:val="Compact"/>
+              <w:jc w:val="right"/>
+            </w:pPr>
+            <w:r>
+              <w:t xml:space="preserve">1.59</w:t>
+            </w:r>
+          </w:p>
+        </w:tc>
+        <w:tc>
+          <w:tcPr/>
+          <w:p>
+            <w:pPr>
+              <w:pStyle w:val="Compact"/>
+            </w:pPr>
+          </w:p>
+        </w:tc>
+        <w:tc>
+          <w:tcPr/>
+          <w:p>
+            <w:pPr>
+              <w:pStyle w:val="Compact"/>
+              <w:jc w:val="right"/>
+            </w:pPr>
+            <w:r>
+              <w:t xml:space="preserve">2.76</w:t>
+            </w:r>
+          </w:p>
+        </w:tc>
+        <w:tc>
+          <w:tcPr/>
+          <w:p>
+            <w:pPr>
+              <w:pStyle w:val="Compact"/>
+              <w:jc w:val="right"/>
+            </w:pPr>
+            <w:r>
+              <w:t xml:space="preserve">0.07</w:t>
+            </w:r>
+          </w:p>
+        </w:tc>
+        <w:tc>
+          <w:tcPr/>
+          <w:p>
+            <w:pPr>
+              <w:pStyle w:val="Compact"/>
+              <w:jc w:val="right"/>
+            </w:pPr>
+            <w:r>
+              <w:t xml:space="preserve">2.58</w:t>
+            </w:r>
+          </w:p>
+        </w:tc>
+      </w:tr>
+      <w:tr>
+        <w:tc>
+          <w:tcPr/>
+          <w:p>
+            <w:pPr>
+              <w:pStyle w:val="Compact"/>
+              <w:jc w:val="left"/>
+            </w:pPr>
+            <w:r>
+              <w:t xml:space="preserve">Arginine</w:t>
+            </w:r>
+          </w:p>
+        </w:tc>
+        <w:tc>
+          <w:tcPr/>
+          <w:p>
+            <w:pPr>
+              <w:pStyle w:val="Compact"/>
+              <w:jc w:val="right"/>
+            </w:pPr>
+            <w:r>
+              <w:t xml:space="preserve">6.87</w:t>
+            </w:r>
+          </w:p>
+        </w:tc>
+        <w:tc>
+          <w:tcPr/>
+          <w:p>
+            <w:pPr>
+              <w:pStyle w:val="Compact"/>
+              <w:jc w:val="right"/>
+            </w:pPr>
+            <w:r>
+              <w:t xml:space="preserve">0.08</w:t>
+            </w:r>
+          </w:p>
+        </w:tc>
+        <w:tc>
+          <w:tcPr/>
+          <w:p>
+            <w:pPr>
+              <w:pStyle w:val="Compact"/>
+              <w:jc w:val="right"/>
+            </w:pPr>
+            <w:r>
+              <w:t xml:space="preserve">1.13</w:t>
+            </w:r>
+          </w:p>
+        </w:tc>
+        <w:tc>
+          <w:tcPr/>
+          <w:p>
+            <w:pPr>
+              <w:pStyle w:val="Compact"/>
+            </w:pPr>
+          </w:p>
+        </w:tc>
+        <w:tc>
+          <w:tcPr/>
+          <w:p>
+            <w:pPr>
+              <w:pStyle w:val="Compact"/>
+              <w:jc w:val="right"/>
+            </w:pPr>
+            <w:r>
+              <w:t xml:space="preserve">8.15</w:t>
+            </w:r>
+          </w:p>
+        </w:tc>
+        <w:tc>
+          <w:tcPr/>
+          <w:p>
+            <w:pPr>
+              <w:pStyle w:val="Compact"/>
+              <w:jc w:val="right"/>
+            </w:pPr>
+            <w:r>
+              <w:t xml:space="preserve">0.20</w:t>
+            </w:r>
+          </w:p>
+        </w:tc>
+        <w:tc>
+          <w:tcPr/>
+          <w:p>
+            <w:pPr>
+              <w:pStyle w:val="Compact"/>
+              <w:jc w:val="right"/>
+            </w:pPr>
+            <w:r>
+              <w:t xml:space="preserve">2.51</w:t>
+            </w:r>
+          </w:p>
+        </w:tc>
+      </w:tr>
+      <w:tr>
+        <w:tc>
+          <w:tcPr/>
+          <w:p>
+            <w:pPr>
+              <w:pStyle w:val="Compact"/>
+              <w:jc w:val="left"/>
+            </w:pPr>
+            <w:r>
+              <w:t xml:space="preserve">Aspartate + asparagine</w:t>
+            </w:r>
+          </w:p>
+        </w:tc>
+        <w:tc>
+          <w:tcPr/>
+          <w:p>
+            <w:pPr>
+              <w:pStyle w:val="Compact"/>
+              <w:jc w:val="right"/>
+            </w:pPr>
+            <w:r>
+              <w:t xml:space="preserve">14.54</w:t>
+            </w:r>
+          </w:p>
+        </w:tc>
+        <w:tc>
+          <w:tcPr/>
+          <w:p>
+            <w:pPr>
+              <w:pStyle w:val="Compact"/>
+              <w:jc w:val="right"/>
+            </w:pPr>
+            <w:r>
+              <w:t xml:space="preserve">0.33</w:t>
+            </w:r>
+          </w:p>
+        </w:tc>
+        <w:tc>
+          <w:tcPr/>
+          <w:p>
+            <w:pPr>
+              <w:pStyle w:val="Compact"/>
+              <w:jc w:val="right"/>
+            </w:pPr>
+            <w:r>
+              <w:t xml:space="preserve">2.28</w:t>
+            </w:r>
+          </w:p>
+        </w:tc>
+        <w:tc>
+          <w:tcPr/>
+          <w:p>
+            <w:pPr>
+              <w:pStyle w:val="Compact"/>
+            </w:pPr>
+          </w:p>
+        </w:tc>
+        <w:tc>
+          <w:tcPr/>
+          <w:p>
+            <w:pPr>
+              <w:pStyle w:val="Compact"/>
+              <w:jc w:val="right"/>
+            </w:pPr>
+            <w:r>
+              <w:t xml:space="preserve">20.93</w:t>
+            </w:r>
+          </w:p>
+        </w:tc>
+        <w:tc>
+          <w:tcPr/>
+          <w:p>
+            <w:pPr>
+              <w:pStyle w:val="Compact"/>
+              <w:jc w:val="right"/>
+            </w:pPr>
+            <w:r>
+              <w:t xml:space="preserve">0.48</w:t>
+            </w:r>
+          </w:p>
+        </w:tc>
+        <w:tc>
+          <w:tcPr/>
+          <w:p>
+            <w:pPr>
+              <w:pStyle w:val="Compact"/>
+              <w:jc w:val="right"/>
+            </w:pPr>
+            <w:r>
+              <w:t xml:space="preserve">2.28</w:t>
+            </w:r>
+          </w:p>
+        </w:tc>
+      </w:tr>
+      <w:tr>
+        <w:tc>
+          <w:tcPr/>
+          <w:p>
+            <w:pPr>
+              <w:pStyle w:val="Compact"/>
+              <w:jc w:val="left"/>
+            </w:pPr>
+            <w:r>
+              <w:t xml:space="preserve">Alanine</w:t>
+            </w:r>
+          </w:p>
+        </w:tc>
+        <w:tc>
+          <w:tcPr/>
+          <w:p>
+            <w:pPr>
+              <w:pStyle w:val="Compact"/>
+              <w:jc w:val="right"/>
+            </w:pPr>
+            <w:r>
+              <w:t xml:space="preserve">15.24</w:t>
+            </w:r>
+          </w:p>
+        </w:tc>
+        <w:tc>
+          <w:tcPr/>
+          <w:p>
+            <w:pPr>
+              <w:pStyle w:val="Compact"/>
+              <w:jc w:val="right"/>
+            </w:pPr>
+            <w:r>
+              <w:t xml:space="preserve">0.17</w:t>
+            </w:r>
+          </w:p>
+        </w:tc>
+        <w:tc>
+          <w:tcPr/>
+          <w:p>
+            <w:pPr>
+              <w:pStyle w:val="Compact"/>
+              <w:jc w:val="right"/>
+            </w:pPr>
+            <w:r>
+              <w:t xml:space="preserve">1.09</w:t>
+            </w:r>
+          </w:p>
+        </w:tc>
+        <w:tc>
+          <w:tcPr/>
+          <w:p>
+            <w:pPr>
+              <w:pStyle w:val="Compact"/>
+            </w:pPr>
+          </w:p>
+        </w:tc>
+        <w:tc>
+          <w:tcPr/>
+          <w:p>
+            <w:pPr>
+              <w:pStyle w:val="Compact"/>
+              <w:jc w:val="right"/>
+            </w:pPr>
+            <w:r>
+              <w:t xml:space="preserve">20.79</w:t>
+            </w:r>
+          </w:p>
+        </w:tc>
+        <w:tc>
+          <w:tcPr/>
+          <w:p>
+            <w:pPr>
+              <w:pStyle w:val="Compact"/>
+              <w:jc w:val="right"/>
+            </w:pPr>
+            <w:r>
+              <w:t xml:space="preserve">0.46</w:t>
+            </w:r>
+          </w:p>
+        </w:tc>
+        <w:tc>
+          <w:tcPr/>
+          <w:p>
+            <w:pPr>
+              <w:pStyle w:val="Compact"/>
+              <w:jc w:val="right"/>
+            </w:pPr>
+            <w:r>
+              <w:t xml:space="preserve">2.22</w:t>
+            </w:r>
+          </w:p>
+        </w:tc>
+      </w:tr>
+      <w:tr>
+        <w:tc>
+          <w:tcPr/>
+          <w:p>
+            <w:pPr>
+              <w:pStyle w:val="Compact"/>
+              <w:jc w:val="left"/>
+            </w:pPr>
+            <w:r>
+              <w:t xml:space="preserve">Proline</w:t>
+            </w:r>
+          </w:p>
+        </w:tc>
+        <w:tc>
+          <w:tcPr/>
+          <w:p>
+            <w:pPr>
+              <w:pStyle w:val="Compact"/>
+              <w:jc w:val="right"/>
+            </w:pPr>
+            <w:r>
+              <w:t xml:space="preserve">7.22</w:t>
+            </w:r>
+          </w:p>
+        </w:tc>
+        <w:tc>
+          <w:tcPr/>
+          <w:p>
+            <w:pPr>
+              <w:pStyle w:val="Compact"/>
+              <w:jc w:val="right"/>
+            </w:pPr>
+            <w:r>
+              <w:t xml:space="preserve">0.04</w:t>
+            </w:r>
+          </w:p>
+        </w:tc>
+        <w:tc>
+          <w:tcPr/>
+          <w:p>
+            <w:pPr>
+              <w:pStyle w:val="Compact"/>
+              <w:jc w:val="right"/>
+            </w:pPr>
+            <w:r>
+              <w:t xml:space="preserve">0.56</w:t>
+            </w:r>
+          </w:p>
+        </w:tc>
+        <w:tc>
+          <w:tcPr/>
+          <w:p>
+            <w:pPr>
+              <w:pStyle w:val="Compact"/>
+            </w:pPr>
+          </w:p>
+        </w:tc>
+        <w:tc>
+          <w:tcPr/>
+          <w:p>
+            <w:pPr>
+              <w:pStyle w:val="Compact"/>
+              <w:jc w:val="right"/>
+            </w:pPr>
+            <w:r>
+              <w:t xml:space="preserve">8.47</w:t>
+            </w:r>
+          </w:p>
+        </w:tc>
+        <w:tc>
+          <w:tcPr/>
+          <w:p>
+            <w:pPr>
+              <w:pStyle w:val="Compact"/>
+              <w:jc w:val="right"/>
+            </w:pPr>
+            <w:r>
+              <w:t xml:space="preserve">0.16</w:t>
+            </w:r>
+          </w:p>
+        </w:tc>
+        <w:tc>
+          <w:tcPr/>
+          <w:p>
+            <w:pPr>
+              <w:pStyle w:val="Compact"/>
+              <w:jc w:val="right"/>
+            </w:pPr>
+            <w:r>
+              <w:t xml:space="preserve">1.86</w:t>
+            </w:r>
+          </w:p>
+        </w:tc>
+      </w:tr>
+      <w:tr>
+        <w:tc>
+          <w:tcPr/>
+          <w:p>
+            <w:pPr>
+              <w:pStyle w:val="Compact"/>
+              <w:jc w:val="left"/>
+            </w:pPr>
+            <w:r>
+              <w:t xml:space="preserve">Serine</w:t>
+            </w:r>
+          </w:p>
+        </w:tc>
+        <w:tc>
+          <w:tcPr/>
+          <w:p>
+            <w:pPr>
+              <w:pStyle w:val="Compact"/>
+              <w:jc w:val="right"/>
+            </w:pPr>
+            <w:r>
+              <w:t xml:space="preserve">20.26</w:t>
+            </w:r>
+          </w:p>
+        </w:tc>
+        <w:tc>
+          <w:tcPr/>
+          <w:p>
+            <w:pPr>
+              <w:pStyle w:val="Compact"/>
+              <w:jc w:val="right"/>
+            </w:pPr>
+            <w:r>
+              <w:t xml:space="preserve">0.21</w:t>
+            </w:r>
+          </w:p>
+        </w:tc>
+        <w:tc>
+          <w:tcPr/>
+          <w:p>
+            <w:pPr>
+              <w:pStyle w:val="Compact"/>
+              <w:jc w:val="right"/>
+            </w:pPr>
+            <w:r>
+              <w:t xml:space="preserve">1.04</w:t>
+            </w:r>
+          </w:p>
+        </w:tc>
+        <w:tc>
+          <w:tcPr/>
+          <w:p>
+            <w:pPr>
+              <w:pStyle w:val="Compact"/>
+            </w:pPr>
+          </w:p>
+        </w:tc>
+        <w:tc>
+          <w:tcPr/>
+          <w:p>
+            <w:pPr>
+              <w:pStyle w:val="Compact"/>
+              <w:jc w:val="right"/>
+            </w:pPr>
+            <w:r>
+              <w:t xml:space="preserve">21.25</w:t>
+            </w:r>
+          </w:p>
+        </w:tc>
+        <w:tc>
+          <w:tcPr/>
+          <w:p>
+            <w:pPr>
+              <w:pStyle w:val="Compact"/>
+              <w:jc w:val="right"/>
+            </w:pPr>
+            <w:r>
+              <w:t xml:space="preserve">0.27</w:t>
+            </w:r>
+          </w:p>
+        </w:tc>
+        <w:tc>
+          <w:tcPr/>
+          <w:p>
+            <w:pPr>
+              <w:pStyle w:val="Compact"/>
+              <w:jc w:val="right"/>
+            </w:pPr>
+            <w:r>
+              <w:t xml:space="preserve">1.27</w:t>
+            </w:r>
+          </w:p>
+        </w:tc>
+      </w:tr>
+      <w:tr>
+        <w:tc>
+          <w:tcPr/>
+          <w:p>
+            <w:pPr>
+              <w:pStyle w:val="Compact"/>
+              <w:jc w:val="left"/>
+            </w:pPr>
+            <w:r>
+              <w:t xml:space="preserve">Glycine</w:t>
+            </w:r>
+          </w:p>
+        </w:tc>
+        <w:tc>
+          <w:tcPr/>
+          <w:p>
+            <w:pPr>
+              <w:pStyle w:val="Compact"/>
+              <w:jc w:val="right"/>
+            </w:pPr>
+            <w:r>
+              <w:t xml:space="preserve">29.57</w:t>
+            </w:r>
+          </w:p>
+        </w:tc>
+        <w:tc>
+          <w:tcPr/>
+          <w:p>
+            <w:pPr>
+              <w:pStyle w:val="Compact"/>
+              <w:jc w:val="right"/>
+            </w:pPr>
+            <w:r>
+              <w:t xml:space="preserve">0.17</w:t>
+            </w:r>
+          </w:p>
+        </w:tc>
+        <w:tc>
+          <w:tcPr/>
+          <w:p>
+            <w:pPr>
+              <w:pStyle w:val="Compact"/>
+              <w:jc w:val="right"/>
+            </w:pPr>
+            <w:r>
+              <w:t xml:space="preserve">0.59</w:t>
+            </w:r>
+          </w:p>
+        </w:tc>
+        <w:tc>
+          <w:tcPr/>
+          <w:p>
+            <w:pPr>
+              <w:pStyle w:val="Compact"/>
+            </w:pPr>
+          </w:p>
+        </w:tc>
+        <w:tc>
+          <w:tcPr/>
+          <w:p>
+            <w:pPr>
+              <w:pStyle w:val="Compact"/>
+              <w:jc w:val="right"/>
+            </w:pPr>
+            <w:r>
+              <w:t xml:space="preserve">29.28</w:t>
+            </w:r>
+          </w:p>
+        </w:tc>
+        <w:tc>
+          <w:tcPr/>
+          <w:p>
+            <w:pPr>
+              <w:pStyle w:val="Compact"/>
+              <w:jc w:val="right"/>
+            </w:pPr>
+            <w:r>
+              <w:t xml:space="preserve">0.34</w:t>
+            </w:r>
+          </w:p>
+        </w:tc>
+        <w:tc>
+          <w:tcPr/>
+          <w:p>
+            <w:pPr>
+              <w:pStyle w:val="Compact"/>
+              <w:jc w:val="right"/>
+            </w:pPr>
+            <w:r>
+              <w:t xml:space="preserve">1.15</w:t>
+            </w:r>
+          </w:p>
+        </w:tc>
+      </w:tr>
+      <w:tr>
+        <w:tc>
+          <w:tcPr/>
+          <w:p>
+            <w:pPr>
+              <w:pStyle w:val="Compact"/>
+              <w:jc w:val="left"/>
+            </w:pPr>
+            <w:r>
+              <w:t xml:space="preserve">Leucine + isoleucine</w:t>
+            </w:r>
+          </w:p>
+        </w:tc>
+        <w:tc>
+          <w:tcPr/>
+          <w:p>
+            <w:pPr>
+              <w:pStyle w:val="Compact"/>
+              <w:jc w:val="right"/>
+            </w:pPr>
+            <w:r>
+              <w:t xml:space="preserve">22.49</w:t>
+            </w:r>
+          </w:p>
+        </w:tc>
+        <w:tc>
+          <w:tcPr/>
+          <w:p>
+            <w:pPr>
+              <w:pStyle w:val="Compact"/>
+              <w:jc w:val="right"/>
+            </w:pPr>
+            <w:r>
+              <w:t xml:space="preserve">0.18</w:t>
+            </w:r>
+          </w:p>
+        </w:tc>
+        <w:tc>
+          <w:tcPr/>
+          <w:p>
+            <w:pPr>
+              <w:pStyle w:val="Compact"/>
+              <w:jc w:val="right"/>
+            </w:pPr>
+            <w:r>
+              <w:t xml:space="preserve">0.78</w:t>
+            </w:r>
+          </w:p>
+        </w:tc>
+        <w:tc>
+          <w:tcPr/>
+          <w:p>
+            <w:pPr>
+              <w:pStyle w:val="Compact"/>
+            </w:pPr>
+          </w:p>
+        </w:tc>
+        <w:tc>
+          <w:tcPr/>
+          <w:p>
+            <w:pPr>
+              <w:pStyle w:val="Compact"/>
+              <w:jc w:val="right"/>
+            </w:pPr>
+            <w:r>
+              <w:t xml:space="preserve">26.95</w:t>
+            </w:r>
+          </w:p>
+        </w:tc>
+        <w:tc>
+          <w:tcPr/>
+          <w:p>
+            <w:pPr>
+              <w:pStyle w:val="Compact"/>
+              <w:jc w:val="right"/>
+            </w:pPr>
+            <w:r>
+              <w:t xml:space="preserve">0.30</w:t>
+            </w:r>
+          </w:p>
+        </w:tc>
+        <w:tc>
+          <w:tcPr/>
+          <w:p>
+            <w:pPr>
+              <w:pStyle w:val="Compact"/>
+              <w:jc w:val="right"/>
+            </w:pPr>
+            <w:r>
+              <w:t xml:space="preserve">1.12</w:t>
+            </w:r>
+          </w:p>
+        </w:tc>
+      </w:tr>
+      <w:tr>
+        <w:tc>
+          <w:tcPr/>
+          <w:p>
+            <w:pPr>
+              <w:pStyle w:val="Compact"/>
+              <w:jc w:val="left"/>
+            </w:pPr>
+            <w:r>
+              <w:t xml:space="preserve">Threonine</w:t>
+            </w:r>
+          </w:p>
+        </w:tc>
+        <w:tc>
+          <w:tcPr/>
+          <w:p>
+            <w:pPr>
+              <w:pStyle w:val="Compact"/>
+              <w:jc w:val="right"/>
+            </w:pPr>
+            <w:r>
+              <w:t xml:space="preserve">12.06</w:t>
+            </w:r>
+          </w:p>
+        </w:tc>
+        <w:tc>
+          <w:tcPr/>
+          <w:p>
+            <w:pPr>
+              <w:pStyle w:val="Compact"/>
+              <w:jc w:val="right"/>
+            </w:pPr>
+            <w:r>
+              <w:t xml:space="preserve">0.03</w:t>
+            </w:r>
+          </w:p>
+        </w:tc>
+        <w:tc>
+          <w:tcPr/>
+          <w:p>
+            <w:pPr>
+              <w:pStyle w:val="Compact"/>
+              <w:jc w:val="right"/>
+            </w:pPr>
+            <w:r>
+              <w:t xml:space="preserve">0.22</w:t>
+            </w:r>
+          </w:p>
+        </w:tc>
+        <w:tc>
+          <w:tcPr/>
+          <w:p>
+            <w:pPr>
+              <w:pStyle w:val="Compact"/>
+            </w:pPr>
+          </w:p>
+        </w:tc>
+        <w:tc>
+          <w:tcPr/>
+          <w:p>
+            <w:pPr>
+              <w:pStyle w:val="Compact"/>
+              <w:jc w:val="right"/>
+            </w:pPr>
+            <w:r>
+              <w:t xml:space="preserve">14.71</w:t>
+            </w:r>
+          </w:p>
+        </w:tc>
+        <w:tc>
+          <w:tcPr/>
+          <w:p>
+            <w:pPr>
+              <w:pStyle w:val="Compact"/>
+              <w:jc w:val="right"/>
+            </w:pPr>
+            <w:r>
+              <w:t xml:space="preserve">0.06</w:t>
+            </w:r>
+          </w:p>
+        </w:tc>
+        <w:tc>
+          <w:tcPr/>
+          <w:p>
+            <w:pPr>
+              <w:pStyle w:val="Compact"/>
+              <w:jc w:val="right"/>
+            </w:pPr>
+            <w:r>
+              <w:t xml:space="preserve">0.38</w:t>
+            </w:r>
+          </w:p>
+        </w:tc>
+      </w:tr>
+    </w:tbl>
     <w:p>
       <w:pPr>
         <w:pStyle w:val="BodyText"/>
       </w:pPr>
       <w:r>
-        <w:t xml:space="preserve">THAAs were 26-52% of the total particulate carbon pool (2.84 µM at 25 meters and 1.36 µM at 175 meters) at T0 and a large part of the total particulate nitrogen (PN, 0.36 µM at 25 meters and 0.15 µM at 175 meters), with total estimated nitrogen in the THAAs sometimes exceeding the total PN measurements. Free amino acids composed between 0.15% and 17% of the total THAA pool with the highest contributions from free glutamate. There were also differences in THAA labeling patterns between the amendments (Figure 3). Despite their shorter incubation time (26 hours vs 73 hours), the inorganic nitrogen amendments generally had higher fractions of labeled protein. The nitrate amendments in particular were surprisingly heavily labeled given the minimal signal seen in free metabolites, with a degree of labeling exceeding the ammonia incubation.</w:t>
+        <w:rPr>
+          <w:i/>
+          <w:iCs/>
+        </w:rPr>
+        <w:t xml:space="preserve">Table 1: Concentrations of all 10 amino acids detected in both the total hydrolyzable (THAA) and dissolved free (DFAA) pools.</w:t>
+      </w:r>
+    </w:p>
+    <w:p>
+      <w:pPr>
+        <w:pStyle w:val="BodyText"/>
+      </w:pPr>
+      <w:r>
+        <w:t xml:space="preserve">There were also differences in THAA labeling patterns between the amendments (Figure 3). Despite their shorter incubation time (26 hours vs 73 hours), the inorganic nitrogen amendments had approximately equal fractions of labeled protein. The nitrate amendments in particular were surprisingly heavily labeled given the minimal signal seen in free metabolites.</w:t>
       </w:r>
     </w:p>
     <w:p>
@@ -988,7 +2055,7 @@
         <w:pStyle w:val="BodyText"/>
       </w:pPr>
       <w:r>
-        <w:t xml:space="preserve">We believe the organic nitrogen amendments largely resulted in metabolite labeling via remineralization to ammonia or glutamate based on the absence of a labeled carbon backbone in most of the labeled metabolites, but in the THAAs we were able to see some transformations that used the carbon backbone as-is. Proline and glutamate both had detectable</w:t>
+        <w:t xml:space="preserve">In the THAAs we were able to see the carbon backbone from the organics propagate into other compounds, resulting in</w:t>
       </w:r>
       <w:r>
         <w:t xml:space="preserve"> </w:t>
@@ -1000,6 +2067,18 @@
         <w:t xml:space="preserve">13</w:t>
       </w:r>
       <w:r>
+        <w:t xml:space="preserve">C labeling in excess of natural abundance. Proline and glutamate both had detectable</w:t>
+      </w:r>
+      <w:r>
+        <w:t xml:space="preserve"> </w:t>
+      </w:r>
+      <w:r>
+        <w:rPr>
+          <w:vertAlign w:val="superscript"/>
+        </w:rPr>
+        <w:t xml:space="preserve">13</w:t>
+      </w:r>
+      <w:r>
         <w:t xml:space="preserve">C</w:t>
       </w:r>
       <w:r>
@@ -1072,7 +2151,7 @@
         <w:t xml:space="preserve"> </w:t>
       </w:r>
       <w:r>
-        <w:t xml:space="preserve">synthesized during the guanosine monophosphate treatment, confirming again that the ribose pool must have been swamped with fully</w:t>
+        <w:t xml:space="preserve">synthesized during the guanosine monophosphate treatment, with the</w:t>
       </w:r>
       <w:r>
         <w:t xml:space="preserve"> </w:t>
@@ -1081,10 +2160,52 @@
         <w:rPr>
           <w:vertAlign w:val="superscript"/>
         </w:rPr>
+        <w:t xml:space="preserve">15</w:t>
+      </w:r>
+      <w:r>
+        <w:t xml:space="preserve">N</w:t>
+      </w:r>
+      <w:r>
+        <w:rPr>
+          <w:vertAlign w:val="subscript"/>
+        </w:rPr>
+        <w:t xml:space="preserve">3</w:t>
+      </w:r>
+      <w:r>
+        <w:t xml:space="preserve"> </w:t>
+      </w:r>
+      <w:r>
+        <w:t xml:space="preserve">pattern indicating that glutamate, glutamine, and adenine were also heavily</w:t>
+      </w:r>
+      <w:r>
+        <w:t xml:space="preserve"> </w:t>
+      </w:r>
+      <w:r>
+        <w:rPr>
+          <w:vertAlign w:val="superscript"/>
+        </w:rPr>
+        <w:t xml:space="preserve">15</w:t>
+      </w:r>
+      <w:r>
+        <w:t xml:space="preserve">N labeled. Finally, both phenylalanine and tyrosine had significant</w:t>
+      </w:r>
+      <w:r>
+        <w:t xml:space="preserve"> </w:t>
+      </w:r>
+      <w:r>
+        <w:rPr>
+          <w:vertAlign w:val="superscript"/>
+        </w:rPr>
         <w:t xml:space="preserve">13</w:t>
       </w:r>
       <w:r>
-        <w:t xml:space="preserve">C labeled ribose cleaved from guanosine in order to enter the phosphoribosyl pyrophosphate pathway. The</w:t>
+        <w:t xml:space="preserve">C</w:t>
+      </w:r>
+      <w:r>
+        <w:rPr>
+          <w:vertAlign w:val="subscript"/>
+        </w:rPr>
+        <w:t xml:space="preserve">4</w:t>
       </w:r>
       <w:r>
         <w:t xml:space="preserve"> </w:t>
@@ -1102,55 +2223,13 @@
         <w:rPr>
           <w:vertAlign w:val="subscript"/>
         </w:rPr>
-        <w:t xml:space="preserve">3</w:t>
-      </w:r>
-      <w:r>
-        <w:t xml:space="preserve"> </w:t>
-      </w:r>
-      <w:r>
-        <w:t xml:space="preserve">pattern also indicates that for these organisms, glutamate, glutamine, and adenine were also heavily labeled. Finally, both phenylalanine and tyrosine had significant</w:t>
-      </w:r>
-      <w:r>
-        <w:t xml:space="preserve"> </w:t>
-      </w:r>
-      <w:r>
-        <w:rPr>
-          <w:vertAlign w:val="superscript"/>
-        </w:rPr>
-        <w:t xml:space="preserve">13</w:t>
-      </w:r>
-      <w:r>
-        <w:t xml:space="preserve">C</w:t>
-      </w:r>
-      <w:r>
-        <w:rPr>
-          <w:vertAlign w:val="subscript"/>
-        </w:rPr>
-        <w:t xml:space="preserve">4</w:t>
-      </w:r>
-      <w:r>
-        <w:t xml:space="preserve"> </w:t>
-      </w:r>
-      <w:r>
-        <w:rPr>
-          <w:vertAlign w:val="superscript"/>
-        </w:rPr>
-        <w:t xml:space="preserve">15</w:t>
-      </w:r>
-      <w:r>
-        <w:t xml:space="preserve">N</w:t>
-      </w:r>
-      <w:r>
-        <w:rPr>
-          <w:vertAlign w:val="subscript"/>
-        </w:rPr>
         <w:t xml:space="preserve">1</w:t>
       </w:r>
       <w:r>
         <w:t xml:space="preserve"> </w:t>
       </w:r>
       <w:r>
-        <w:t xml:space="preserve">labeling, likely from erythrose 4-phosphate via the pentose phosphate pathway indicating new synthesis through shikimate with nitrogen addition from a heavily labeled glutamate pool again.</w:t>
+        <w:t xml:space="preserve">labeling in the GMP amendments.</w:t>
       </w:r>
     </w:p>
     <w:bookmarkEnd w:id="31"/>
@@ -3056,6 +4135,182 @@
     <w:p>
       <w:pPr>
         <w:pStyle w:val="FirstParagraph"/>
+      </w:pPr>
+      <w:r>
+        <w:t xml:space="preserve">Section that was too much discussion and has since been gutted for the results alone but needs to be discussed:</w:t>
+      </w:r>
+      <w:r>
+        <w:t xml:space="preserve"> </w:t>
+      </w:r>
+      <w:r>
+        <w:t xml:space="preserve">We believe the organic nitrogen amendments largely resulted in metabolite labeling via remineralization to ammonia or glutamate based on the absence of a labeled carbon backbone in most of the labeled metabolites, but in the THAAs we were able to see some transformations that used the carbon backbone as-is. Proline and glutamate both had detectable</w:t>
+      </w:r>
+      <w:r>
+        <w:t xml:space="preserve"> </w:t>
+      </w:r>
+      <w:r>
+        <w:rPr>
+          <w:vertAlign w:val="superscript"/>
+        </w:rPr>
+        <w:t xml:space="preserve">13</w:t>
+      </w:r>
+      <w:r>
+        <w:t xml:space="preserve">C</w:t>
+      </w:r>
+      <w:r>
+        <w:rPr>
+          <w:vertAlign w:val="subscript"/>
+        </w:rPr>
+        <w:t xml:space="preserve">5</w:t>
+      </w:r>
+      <w:r>
+        <w:t xml:space="preserve"> </w:t>
+      </w:r>
+      <w:r>
+        <w:rPr>
+          <w:vertAlign w:val="superscript"/>
+        </w:rPr>
+        <w:t xml:space="preserve">15</w:t>
+      </w:r>
+      <w:r>
+        <w:t xml:space="preserve">N</w:t>
+      </w:r>
+      <w:r>
+        <w:rPr>
+          <w:vertAlign w:val="subscript"/>
+        </w:rPr>
+        <w:t xml:space="preserve">1</w:t>
+      </w:r>
+      <w:r>
+        <w:t xml:space="preserve"> </w:t>
+      </w:r>
+      <w:r>
+        <w:t xml:space="preserve">labels in the arginine treatments. We also saw histidine</w:t>
+      </w:r>
+      <w:r>
+        <w:t xml:space="preserve"> </w:t>
+      </w:r>
+      <w:r>
+        <w:rPr>
+          <w:vertAlign w:val="superscript"/>
+        </w:rPr>
+        <w:t xml:space="preserve">13</w:t>
+      </w:r>
+      <w:r>
+        <w:t xml:space="preserve">C</w:t>
+      </w:r>
+      <w:r>
+        <w:rPr>
+          <w:vertAlign w:val="subscript"/>
+        </w:rPr>
+        <w:t xml:space="preserve">5</w:t>
+      </w:r>
+      <w:r>
+        <w:t xml:space="preserve"> </w:t>
+      </w:r>
+      <w:r>
+        <w:rPr>
+          <w:vertAlign w:val="superscript"/>
+        </w:rPr>
+        <w:t xml:space="preserve">15</w:t>
+      </w:r>
+      <w:r>
+        <w:t xml:space="preserve">N</w:t>
+      </w:r>
+      <w:r>
+        <w:rPr>
+          <w:vertAlign w:val="subscript"/>
+        </w:rPr>
+        <w:t xml:space="preserve">3</w:t>
+      </w:r>
+      <w:r>
+        <w:t xml:space="preserve"> </w:t>
+      </w:r>
+      <w:r>
+        <w:t xml:space="preserve">synthesized during the guanosine monophosphate treatment, confirming again that the ribose pool must have been swamped with fully</w:t>
+      </w:r>
+      <w:r>
+        <w:t xml:space="preserve"> </w:t>
+      </w:r>
+      <w:r>
+        <w:rPr>
+          <w:vertAlign w:val="superscript"/>
+        </w:rPr>
+        <w:t xml:space="preserve">13</w:t>
+      </w:r>
+      <w:r>
+        <w:t xml:space="preserve">C labeled ribose cleaved from guanosine in order to enter the phosphoribosyl pyrophosphate pathway. The</w:t>
+      </w:r>
+      <w:r>
+        <w:t xml:space="preserve"> </w:t>
+      </w:r>
+      <w:r>
+        <w:rPr>
+          <w:vertAlign w:val="superscript"/>
+        </w:rPr>
+        <w:t xml:space="preserve">15</w:t>
+      </w:r>
+      <w:r>
+        <w:t xml:space="preserve">N</w:t>
+      </w:r>
+      <w:r>
+        <w:rPr>
+          <w:vertAlign w:val="subscript"/>
+        </w:rPr>
+        <w:t xml:space="preserve">3</w:t>
+      </w:r>
+      <w:r>
+        <w:t xml:space="preserve"> </w:t>
+      </w:r>
+      <w:r>
+        <w:t xml:space="preserve">pattern also indicates that for these organisms, glutamate, glutamine, and adenine were also heavily labeled. Finally, both phenylalanine and tyrosine had significant</w:t>
+      </w:r>
+      <w:r>
+        <w:t xml:space="preserve"> </w:t>
+      </w:r>
+      <w:r>
+        <w:rPr>
+          <w:vertAlign w:val="superscript"/>
+        </w:rPr>
+        <w:t xml:space="preserve">13</w:t>
+      </w:r>
+      <w:r>
+        <w:t xml:space="preserve">C</w:t>
+      </w:r>
+      <w:r>
+        <w:rPr>
+          <w:vertAlign w:val="subscript"/>
+        </w:rPr>
+        <w:t xml:space="preserve">4</w:t>
+      </w:r>
+      <w:r>
+        <w:t xml:space="preserve"> </w:t>
+      </w:r>
+      <w:r>
+        <w:rPr>
+          <w:vertAlign w:val="superscript"/>
+        </w:rPr>
+        <w:t xml:space="preserve">15</w:t>
+      </w:r>
+      <w:r>
+        <w:t xml:space="preserve">N</w:t>
+      </w:r>
+      <w:r>
+        <w:rPr>
+          <w:vertAlign w:val="subscript"/>
+        </w:rPr>
+        <w:t xml:space="preserve">1</w:t>
+      </w:r>
+      <w:r>
+        <w:t xml:space="preserve"> </w:t>
+      </w:r>
+      <w:r>
+        <w:t xml:space="preserve">labeling, likely from erythrose 4-phosphate via the pentose phosphate pathway indicating new synthesis through shikimate with nitrogen addition from a heavily labeled glutamate pool again.</w:t>
+      </w:r>
+    </w:p>
+    <w:p>
+      <w:pPr>
+        <w:pStyle w:val="BodyText"/>
       </w:pPr>
       <w:r>
         <w:t xml:space="preserve">Need more discussion of betaines and cholines? Ask Anitra</w:t>

</xml_diff>